<commit_message>
se cambia el nombre del archivo y se añaden las referencias
</commit_message>
<xml_diff>
--- a/Informe-celula-2.docx
+++ b/Informe-celula-2.docx
@@ -1428,7 +1428,7 @@
       <w:r>
         <w:rPr>
           <w:rStyle w:val="Enlacedelndice"/>
-          <w:vanish/>
+          <w:vanish w:val="false"/>
           <w:rFonts w:ascii="Times New Roman" w:hAnsi="Times New Roman"/>
         </w:rPr>
         <w:instrText xml:space="preserve"> TOC \c "Ilustración" \h </w:instrText>
@@ -1436,7 +1436,7 @@
       <w:r>
         <w:rPr>
           <w:rStyle w:val="Enlacedelndice"/>
-          <w:vanish/>
+          <w:vanish w:val="false"/>
           <w:rFonts w:ascii="Times New Roman" w:hAnsi="Times New Roman"/>
         </w:rPr>
         <w:fldChar w:fldCharType="separate"/>
@@ -1464,7 +1464,7 @@
           <w:rPr>
             <w:rStyle w:val="Enlacedelndice"/>
             <w:rFonts w:ascii="Times New Roman" w:hAnsi="Times New Roman"/>
-            <w:vanish/>
+            <w:vanish w:val="false"/>
           </w:rPr>
           <w:t>Ilustración 1 - Stack tecnologico</w:t>
         </w:r>
@@ -1478,7 +1478,7 @@
       <w:r>
         <w:rPr>
           <w:rStyle w:val="Enlacedelndice"/>
-          <w:vanish/>
+          <w:vanish w:val="false"/>
           <w:rFonts w:ascii="Times New Roman" w:hAnsi="Times New Roman"/>
         </w:rPr>
         <w:fldChar w:fldCharType="end"/>
@@ -2013,20 +2013,7 @@
         <w:rPr>
           <w:rFonts w:ascii="Times New Roman" w:hAnsi="Times New Roman"/>
         </w:rPr>
-        <w:t>Diseñar y desarrollar una aplicación para la gestión integral de la barbería, que centralice la reserva de citas, el control de los servicios y la administración de los clientes, con el fin de optimizar el tiempo de operación diaria y mejorar la experiencia de servicio.</w:t>
-      </w:r>
-    </w:p>
-    <w:p>
-      <w:pPr>
-        <w:pStyle w:val="Normal"/>
-        <w:rPr>
-          <w:rFonts w:ascii="Times New Roman" w:hAnsi="Times New Roman"/>
-        </w:rPr>
-      </w:pPr>
-      <w:r>
-        <w:rPr>
-          <w:rFonts w:ascii="Times New Roman" w:hAnsi="Times New Roman"/>
-        </w:rPr>
+        <w:t>el propósito es desarrollar una plataforma web para la gestión y digitalización del catálogo de recetas y contenidos de Sazón, permitiendo a los usuarios explorar y encontrar preparaciones basadas en productos de Nutresa disponibles en el hogar.</w:t>
       </w:r>
     </w:p>
     <w:p>
@@ -2058,82 +2045,516 @@
     </w:p>
     <w:p>
       <w:pPr>
-        <w:pStyle w:val="ListParagraph"/>
+        <w:pStyle w:val="Apa7ma"/>
+        <w:widowControl/>
         <w:numPr>
           <w:ilvl w:val="0"/>
-          <w:numId w:val="1"/>
+          <w:numId w:val="0"/>
         </w:numPr>
-        <w:spacing w:lineRule="auto" w:line="480"/>
-        <w:ind w:hanging="357" w:start="1077"/>
-        <w:rPr>
-          <w:rFonts w:ascii="Times New Roman" w:hAnsi="Times New Roman"/>
-        </w:rPr>
-      </w:pPr>
-      <w:r>
-        <w:rPr>
-          <w:rFonts w:ascii="Times New Roman" w:hAnsi="Times New Roman"/>
-        </w:rPr>
-        <w:t>Implementar un módulo de agendamiento en línea que permita a los clientes reservar, modificar o cancelar sus citas en tiempo real, basándose en la disponibilidad de cada barbero.</w:t>
-      </w:r>
-    </w:p>
-    <w:p>
-      <w:pPr>
-        <w:pStyle w:val="ListParagraph"/>
+        <w:suppressAutoHyphens w:val="false"/>
+        <w:bidi w:val="0"/>
+        <w:spacing w:lineRule="auto" w:line="480" w:before="240" w:after="240"/>
+        <w:ind w:hanging="0" w:start="1080"/>
+        <w:jc w:val="start"/>
+        <w:rPr>
+          <w:rFonts w:ascii="Times New Roman" w:hAnsi="Times New Roman" w:eastAsia="Times New Roman" w:cs="Arial"/>
+          <w:color w:val="000000"/>
+          <w:kern w:val="0"/>
+          <w:sz w:val="24"/>
+          <w:szCs w:val="24"/>
+          <w:lang w:val="es-CO" w:eastAsia="en-US" w:bidi="ar-SA"/>
+          <w14:ligatures w14:val="none"/>
+        </w:rPr>
+      </w:pPr>
+      <w:r>
+        <w:rPr>
+          <w:rFonts w:eastAsia="Times New Roman" w:cs="Arial"/>
+          <w:b/>
+          <w:bCs/>
+          <w:color w:val="000000"/>
+          <w:kern w:val="0"/>
+          <w:sz w:val="24"/>
+          <w:szCs w:val="24"/>
+          <w:lang w:val="es-CO" w:eastAsia="en-US" w:bidi="ar-SA"/>
+          <w14:ligatures w14:val="none"/>
+        </w:rPr>
+        <w:t>Modelar y estructurar la base de datos relacional</w:t>
+      </w:r>
+      <w:r>
+        <w:rPr>
+          <w:rFonts w:eastAsia="Times New Roman" w:cs="Arial"/>
+          <w:color w:val="000000"/>
+          <w:kern w:val="0"/>
+          <w:sz w:val="24"/>
+          <w:szCs w:val="24"/>
+          <w:lang w:val="es-CO" w:eastAsia="en-US" w:bidi="ar-SA"/>
+          <w14:ligatures w14:val="none"/>
+        </w:rPr>
+        <w:t>:</w:t>
+      </w:r>
+    </w:p>
+    <w:p>
+      <w:pPr>
+        <w:pStyle w:val="Apa7ma"/>
+        <w:widowControl/>
         <w:numPr>
           <w:ilvl w:val="0"/>
-          <w:numId w:val="1"/>
+          <w:numId w:val="0"/>
         </w:numPr>
-        <w:spacing w:lineRule="auto" w:line="480"/>
-        <w:ind w:hanging="357" w:start="1077"/>
-        <w:rPr>
-          <w:rFonts w:ascii="Times New Roman" w:hAnsi="Times New Roman"/>
-        </w:rPr>
-      </w:pPr>
-      <w:r>
-        <w:rPr>
-          <w:rFonts w:ascii="Times New Roman" w:hAnsi="Times New Roman"/>
-        </w:rPr>
-        <w:t>Crear un sistema de perfiles para registrar el historial de los clientes, incluyendo sus cortes frecuentes, preferencias y datos de contacto, facilitando un servicio más personalizado.</w:t>
-      </w:r>
-    </w:p>
-    <w:p>
-      <w:pPr>
-        <w:pStyle w:val="ListParagraph"/>
+        <w:bidi w:val="0"/>
+        <w:ind w:hanging="0" w:start="0"/>
+        <w:jc w:val="start"/>
+        <w:rPr>
+          <w:rFonts w:ascii="Times New Roman" w:hAnsi="Times New Roman"/>
+          <w:sz w:val="24"/>
+          <w:szCs w:val="24"/>
+          <w:lang w:val="es-CO" w:eastAsia="en-US" w:bidi="ar-SA"/>
+        </w:rPr>
+      </w:pPr>
+      <w:r>
+        <w:rPr>
+          <w:sz w:val="24"/>
+          <w:szCs w:val="24"/>
+          <w:lang w:val="es-CO" w:eastAsia="en-US" w:bidi="ar-SA"/>
+        </w:rPr>
+        <w:t>Diseñar el diagrama entidad-relación para clasificar formalmente las recetas, ingredientes, unidades de medida, categorías culinarias y tiempos de preparación.</w:t>
+      </w:r>
+    </w:p>
+    <w:p>
+      <w:pPr>
+        <w:pStyle w:val="Apa7ma"/>
+        <w:widowControl/>
         <w:numPr>
           <w:ilvl w:val="0"/>
-          <w:numId w:val="1"/>
+          <w:numId w:val="0"/>
         </w:numPr>
-        <w:spacing w:lineRule="auto" w:line="480"/>
-        <w:ind w:hanging="357" w:start="1077"/>
-        <w:rPr>
-          <w:rFonts w:ascii="Times New Roman" w:hAnsi="Times New Roman"/>
-        </w:rPr>
-      </w:pPr>
-      <w:r>
-        <w:rPr>
-          <w:rFonts w:ascii="Times New Roman" w:hAnsi="Times New Roman"/>
-        </w:rPr>
-        <w:t>Desarrollar un panel de administración interno para que los barberos puedan gestionar sus horarios, visualizar las citas del día y registrar los servicios que ya completaron.</w:t>
-      </w:r>
-    </w:p>
-    <w:p>
-      <w:pPr>
-        <w:pStyle w:val="ListParagraph"/>
+        <w:bidi w:val="0"/>
+        <w:ind w:hanging="0" w:start="0"/>
+        <w:jc w:val="start"/>
+        <w:rPr>
+          <w:rFonts w:ascii="Times New Roman" w:hAnsi="Times New Roman"/>
+          <w:sz w:val="24"/>
+          <w:szCs w:val="24"/>
+          <w:lang w:val="es-CO" w:eastAsia="en-US" w:bidi="ar-SA"/>
+        </w:rPr>
+      </w:pPr>
+      <w:r>
+        <w:rPr>
+          <w:sz w:val="24"/>
+          <w:szCs w:val="24"/>
+          <w:lang w:val="es-CO" w:eastAsia="en-US" w:bidi="ar-SA"/>
+        </w:rPr>
+        <w:t>Implementar restricciones de integridad referencial para garantizar que cada receta esté vinculada de forma precisa con la cartera de productos comercializados por Servicios Nutresa.</w:t>
+      </w:r>
+    </w:p>
+    <w:p>
+      <w:pPr>
+        <w:pStyle w:val="Apa7ma"/>
+        <w:widowControl/>
         <w:numPr>
           <w:ilvl w:val="0"/>
-          <w:numId w:val="1"/>
+          <w:numId w:val="0"/>
         </w:numPr>
-        <w:spacing w:lineRule="auto" w:line="480"/>
-        <w:ind w:hanging="357" w:start="1077"/>
-        <w:rPr>
-          <w:rFonts w:ascii="Times New Roman" w:hAnsi="Times New Roman"/>
-        </w:rPr>
-      </w:pPr>
-      <w:r>
-        <w:rPr>
-          <w:rFonts w:ascii="Times New Roman" w:hAnsi="Times New Roman"/>
-        </w:rPr>
-        <w:t>Integrar un sistema de notificaciones automáticas que envíe recordatorios a los clientes antes de sus citas programadas, para reducir los tiempos muertos y las inasistencias.</w:t>
+        <w:bidi w:val="0"/>
+        <w:ind w:hanging="0" w:start="1080"/>
+        <w:jc w:val="start"/>
+        <w:rPr>
+          <w:rFonts w:ascii="Times New Roman" w:hAnsi="Times New Roman"/>
+          <w:b/>
+          <w:bCs/>
+          <w:sz w:val="24"/>
+          <w:szCs w:val="24"/>
+          <w:lang w:val="es-CO" w:eastAsia="en-US" w:bidi="ar-SA"/>
+        </w:rPr>
+      </w:pPr>
+      <w:r>
+        <w:rPr>
+          <w:b/>
+          <w:bCs/>
+          <w:sz w:val="24"/>
+          <w:szCs w:val="24"/>
+          <w:lang w:val="es-CO" w:eastAsia="en-US" w:bidi="ar-SA"/>
+        </w:rPr>
+        <w:t>Desarrollar e integrar el módulo de gestión de contenidos (Recetario):</w:t>
+      </w:r>
+    </w:p>
+    <w:p>
+      <w:pPr>
+        <w:pStyle w:val="Apa7ma"/>
+        <w:widowControl/>
+        <w:numPr>
+          <w:ilvl w:val="0"/>
+          <w:numId w:val="7"/>
+        </w:numPr>
+        <w:tabs>
+          <w:tab w:val="clear" w:pos="708"/>
+          <w:tab w:val="left" w:pos="0" w:leader="none"/>
+        </w:tabs>
+        <w:bidi w:val="0"/>
+        <w:ind w:firstLine="437" w:start="709"/>
+        <w:jc w:val="start"/>
+        <w:rPr>
+          <w:rFonts w:ascii="Times New Roman" w:hAnsi="Times New Roman"/>
+          <w:sz w:val="24"/>
+          <w:szCs w:val="24"/>
+          <w:lang w:val="es-CO" w:eastAsia="en-US" w:bidi="ar-SA"/>
+        </w:rPr>
+      </w:pPr>
+      <w:r>
+        <w:rPr>
+          <w:sz w:val="24"/>
+          <w:szCs w:val="24"/>
+          <w:lang w:val="es-CO" w:eastAsia="en-US" w:bidi="ar-SA"/>
+        </w:rPr>
+        <w:t>Programar la lógica de negocio para la lectura, organización y presentación dinámica de los platillos.</w:t>
+      </w:r>
+    </w:p>
+    <w:p>
+      <w:pPr>
+        <w:pStyle w:val="Apa7ma"/>
+        <w:widowControl/>
+        <w:numPr>
+          <w:ilvl w:val="0"/>
+          <w:numId w:val="7"/>
+        </w:numPr>
+        <w:tabs>
+          <w:tab w:val="clear" w:pos="708"/>
+          <w:tab w:val="left" w:pos="0" w:leader="none"/>
+        </w:tabs>
+        <w:bidi w:val="0"/>
+        <w:ind w:firstLine="437" w:start="709"/>
+        <w:jc w:val="start"/>
+        <w:rPr>
+          <w:rFonts w:ascii="Times New Roman" w:hAnsi="Times New Roman"/>
+          <w:sz w:val="24"/>
+          <w:szCs w:val="24"/>
+          <w:lang w:val="es-CO" w:eastAsia="en-US" w:bidi="ar-SA"/>
+        </w:rPr>
+      </w:pPr>
+      <w:r>
+        <w:rPr>
+          <w:sz w:val="24"/>
+          <w:szCs w:val="24"/>
+          <w:lang w:val="es-CO" w:eastAsia="en-US" w:bidi="ar-SA"/>
+        </w:rPr>
+        <w:t>Estructurar el motor de recetas priorizando el aprovechamiento de los insumos y productos de la marca que el usuario final habitualmente consume o posee en su hogar.</w:t>
+      </w:r>
+    </w:p>
+    <w:p>
+      <w:pPr>
+        <w:pStyle w:val="Apa7ma"/>
+        <w:widowControl/>
+        <w:numPr>
+          <w:ilvl w:val="0"/>
+          <w:numId w:val="0"/>
+        </w:numPr>
+        <w:bidi w:val="0"/>
+        <w:ind w:hanging="0" w:start="720"/>
+        <w:jc w:val="start"/>
+        <w:rPr/>
+      </w:pPr>
+      <w:r>
+        <w:rPr>
+          <w:rFonts w:eastAsia="Times New Roman" w:cs="Arial"/>
+          <w:b/>
+          <w:bCs/>
+          <w:color w:val="000000"/>
+          <w:kern w:val="0"/>
+          <w:sz w:val="24"/>
+          <w:szCs w:val="24"/>
+          <w:lang w:val="es-CO" w:eastAsia="en-US" w:bidi="ar-SA"/>
+          <w14:ligatures w14:val="none"/>
+        </w:rPr>
+        <w:t>Diseñar e implementar un motor de búsqueda y filtrado avanzado:</w:t>
+      </w:r>
+    </w:p>
+    <w:p>
+      <w:pPr>
+        <w:pStyle w:val="Apa7ma"/>
+        <w:widowControl/>
+        <w:numPr>
+          <w:ilvl w:val="0"/>
+          <w:numId w:val="8"/>
+        </w:numPr>
+        <w:tabs>
+          <w:tab w:val="clear" w:pos="708"/>
+          <w:tab w:val="left" w:pos="0" w:leader="none"/>
+        </w:tabs>
+        <w:bidi w:val="0"/>
+        <w:ind w:firstLine="437" w:start="709"/>
+        <w:jc w:val="start"/>
+        <w:rPr>
+          <w:rFonts w:ascii="Times New Roman" w:hAnsi="Times New Roman"/>
+          <w:sz w:val="24"/>
+          <w:szCs w:val="24"/>
+          <w:lang w:val="es-CO" w:eastAsia="en-US" w:bidi="ar-SA"/>
+        </w:rPr>
+      </w:pPr>
+      <w:r>
+        <w:rPr>
+          <w:sz w:val="24"/>
+          <w:szCs w:val="24"/>
+          <w:lang w:val="es-CO" w:eastAsia="en-US" w:bidi="ar-SA"/>
+        </w:rPr>
+        <w:t>Desarrollar algoritmos de búsqueda eficientes que permitan filtrar recetas por ingredientes específicos, nivel de dificultad, tiempo de elaboración o categoría.</w:t>
+      </w:r>
+    </w:p>
+    <w:p>
+      <w:pPr>
+        <w:pStyle w:val="Apa7ma"/>
+        <w:widowControl/>
+        <w:numPr>
+          <w:ilvl w:val="0"/>
+          <w:numId w:val="8"/>
+        </w:numPr>
+        <w:tabs>
+          <w:tab w:val="clear" w:pos="708"/>
+          <w:tab w:val="left" w:pos="0" w:leader="none"/>
+        </w:tabs>
+        <w:bidi w:val="0"/>
+        <w:ind w:firstLine="437" w:start="709"/>
+        <w:jc w:val="start"/>
+        <w:rPr>
+          <w:rFonts w:ascii="Times New Roman" w:hAnsi="Times New Roman"/>
+          <w:sz w:val="24"/>
+          <w:szCs w:val="24"/>
+          <w:lang w:val="es-CO" w:eastAsia="en-US" w:bidi="ar-SA"/>
+        </w:rPr>
+      </w:pPr>
+      <w:r>
+        <w:rPr>
+          <w:sz w:val="24"/>
+          <w:szCs w:val="24"/>
+          <w:lang w:val="es-CO" w:eastAsia="en-US" w:bidi="ar-SA"/>
+        </w:rPr>
+        <w:t>Optimizar las consultas a la base de datos para ofrecer tiempos de respuesta rápidos y precisos durante la navegación del usuario.</w:t>
+      </w:r>
+    </w:p>
+    <w:p>
+      <w:pPr>
+        <w:pStyle w:val="Apa7ma"/>
+        <w:widowControl/>
+        <w:numPr>
+          <w:ilvl w:val="0"/>
+          <w:numId w:val="0"/>
+        </w:numPr>
+        <w:bidi w:val="0"/>
+        <w:ind w:hanging="0" w:start="0"/>
+        <w:jc w:val="start"/>
+        <w:rPr/>
+      </w:pPr>
+      <w:r>
+        <w:rPr>
+          <w:b/>
+          <w:bCs/>
+          <w:sz w:val="24"/>
+          <w:szCs w:val="24"/>
+          <w:lang w:val="es-CO" w:eastAsia="en-US" w:bidi="ar-SA"/>
+        </w:rPr>
+        <w:t>C</w:t>
+      </w:r>
+      <w:r>
+        <w:rPr>
+          <w:rFonts w:eastAsia="Times New Roman" w:cs="Arial"/>
+          <w:b/>
+          <w:bCs/>
+          <w:color w:val="000000"/>
+          <w:kern w:val="0"/>
+          <w:sz w:val="24"/>
+          <w:szCs w:val="24"/>
+          <w:lang w:val="es-CO" w:eastAsia="en-US" w:bidi="ar-SA"/>
+          <w14:ligatures w14:val="none"/>
+        </w:rPr>
+        <w:t>onstruir una interfaz de usuario (UI/UX) accesible y adaptativa</w:t>
+      </w:r>
+      <w:r>
+        <w:rPr>
+          <w:sz w:val="24"/>
+          <w:szCs w:val="24"/>
+          <w:lang w:val="es-CO" w:eastAsia="en-US" w:bidi="ar-SA"/>
+        </w:rPr>
+        <w:t>:</w:t>
+      </w:r>
+    </w:p>
+    <w:p>
+      <w:pPr>
+        <w:pStyle w:val="Apa7ma"/>
+        <w:widowControl/>
+        <w:numPr>
+          <w:ilvl w:val="0"/>
+          <w:numId w:val="10"/>
+        </w:numPr>
+        <w:tabs>
+          <w:tab w:val="clear" w:pos="708"/>
+          <w:tab w:val="left" w:pos="0" w:leader="none"/>
+        </w:tabs>
+        <w:bidi w:val="0"/>
+        <w:ind w:firstLine="437" w:start="709"/>
+        <w:jc w:val="start"/>
+        <w:rPr>
+          <w:rFonts w:ascii="Times New Roman" w:hAnsi="Times New Roman"/>
+          <w:sz w:val="24"/>
+          <w:szCs w:val="24"/>
+          <w:lang w:val="es-CO" w:eastAsia="en-US" w:bidi="ar-SA"/>
+        </w:rPr>
+      </w:pPr>
+      <w:r>
+        <w:rPr>
+          <w:sz w:val="24"/>
+          <w:szCs w:val="24"/>
+          <w:lang w:val="es-CO" w:eastAsia="en-US" w:bidi="ar-SA"/>
+        </w:rPr>
+        <w:t>Implementar un diseño adaptable (responsive design) mediante el uso de estándares web como HTML5, CSS3 y JavaScript para asegurar una lectura cómoda en dispositivos móviles, tabletas y computadores.</w:t>
+      </w:r>
+    </w:p>
+    <w:p>
+      <w:pPr>
+        <w:pStyle w:val="Apa7ma"/>
+        <w:widowControl/>
+        <w:numPr>
+          <w:ilvl w:val="0"/>
+          <w:numId w:val="10"/>
+        </w:numPr>
+        <w:tabs>
+          <w:tab w:val="clear" w:pos="708"/>
+          <w:tab w:val="left" w:pos="0" w:leader="none"/>
+        </w:tabs>
+        <w:bidi w:val="0"/>
+        <w:ind w:firstLine="437" w:start="709"/>
+        <w:jc w:val="start"/>
+        <w:rPr>
+          <w:rFonts w:ascii="Times New Roman" w:hAnsi="Times New Roman"/>
+          <w:sz w:val="24"/>
+          <w:szCs w:val="24"/>
+          <w:lang w:val="es-CO" w:eastAsia="en-US" w:bidi="ar-SA"/>
+        </w:rPr>
+      </w:pPr>
+      <w:r>
+        <w:rPr>
+          <w:sz w:val="24"/>
+          <w:szCs w:val="24"/>
+          <w:lang w:val="es-CO" w:eastAsia="en-US" w:bidi="ar-SA"/>
+        </w:rPr>
+        <w:t>Garantizar una navegación intuitiva que facilite la consulta de los pasos de preparación y la visualización clara de la lista de ingredientes.</w:t>
+      </w:r>
+    </w:p>
+    <w:p>
+      <w:pPr>
+        <w:pStyle w:val="Apa7ma"/>
+        <w:widowControl/>
+        <w:numPr>
+          <w:ilvl w:val="0"/>
+          <w:numId w:val="0"/>
+        </w:numPr>
+        <w:bidi w:val="0"/>
+        <w:ind w:hanging="0" w:start="0"/>
+        <w:jc w:val="start"/>
+        <w:rPr>
+          <w:rFonts w:ascii="Times New Roman" w:hAnsi="Times New Roman"/>
+          <w:b/>
+          <w:bCs/>
+          <w:sz w:val="24"/>
+          <w:szCs w:val="24"/>
+          <w:lang w:val="es-CO" w:eastAsia="en-US" w:bidi="ar-SA"/>
+        </w:rPr>
+      </w:pPr>
+      <w:r>
+        <w:rPr>
+          <w:b/>
+          <w:bCs/>
+          <w:sz w:val="24"/>
+          <w:szCs w:val="24"/>
+          <w:lang w:val="es-CO" w:eastAsia="en-US" w:bidi="ar-SA"/>
+        </w:rPr>
+        <w:t>Validar la funcionalidad del sistema mediante pruebas integrales:</w:t>
+      </w:r>
+    </w:p>
+    <w:p>
+      <w:pPr>
+        <w:pStyle w:val="Apa7ma"/>
+        <w:widowControl/>
+        <w:numPr>
+          <w:ilvl w:val="0"/>
+          <w:numId w:val="11"/>
+        </w:numPr>
+        <w:tabs>
+          <w:tab w:val="clear" w:pos="708"/>
+          <w:tab w:val="left" w:pos="0" w:leader="none"/>
+        </w:tabs>
+        <w:bidi w:val="0"/>
+        <w:ind w:firstLine="437" w:start="709"/>
+        <w:jc w:val="start"/>
+        <w:rPr>
+          <w:rFonts w:ascii="Times New Roman" w:hAnsi="Times New Roman"/>
+          <w:sz w:val="24"/>
+          <w:szCs w:val="24"/>
+          <w:lang w:val="es-CO" w:eastAsia="en-US" w:bidi="ar-SA"/>
+        </w:rPr>
+      </w:pPr>
+      <w:r>
+        <w:rPr>
+          <w:sz w:val="24"/>
+          <w:szCs w:val="24"/>
+          <w:lang w:val="es-CO" w:eastAsia="en-US" w:bidi="ar-SA"/>
+        </w:rPr>
+        <w:t>Ejecutar pruebas unitarias y de integración para comprobar la consistencia de los datos almacenados y el correcto funcionamiento de los filtros.</w:t>
+      </w:r>
+    </w:p>
+    <w:p>
+      <w:pPr>
+        <w:pStyle w:val="Apa7ma"/>
+        <w:widowControl/>
+        <w:numPr>
+          <w:ilvl w:val="0"/>
+          <w:numId w:val="11"/>
+        </w:numPr>
+        <w:tabs>
+          <w:tab w:val="clear" w:pos="708"/>
+          <w:tab w:val="left" w:pos="0" w:leader="none"/>
+        </w:tabs>
+        <w:bidi w:val="0"/>
+        <w:ind w:firstLine="437" w:start="709"/>
+        <w:jc w:val="start"/>
+        <w:rPr>
+          <w:rFonts w:ascii="Times New Roman" w:hAnsi="Times New Roman"/>
+          <w:sz w:val="24"/>
+          <w:szCs w:val="24"/>
+          <w:lang w:val="es-CO" w:eastAsia="en-US" w:bidi="ar-SA"/>
+        </w:rPr>
+      </w:pPr>
+      <w:r>
+        <w:rPr>
+          <w:sz w:val="24"/>
+          <w:szCs w:val="24"/>
+          <w:lang w:val="es-CO" w:eastAsia="en-US" w:bidi="ar-SA"/>
+        </w:rPr>
+        <w:t>Verificar que las búsquedas por productos retornen de manera exacta las recetas asociadas, evitando la presencia de datos nulos o duplicados.</w:t>
+      </w:r>
+    </w:p>
+    <w:p>
+      <w:pPr>
+        <w:pStyle w:val="Apa7ma"/>
+        <w:widowControl/>
+        <w:numPr>
+          <w:ilvl w:val="0"/>
+          <w:numId w:val="0"/>
+        </w:numPr>
+        <w:bidi w:val="0"/>
+        <w:ind w:hanging="0" w:start="1080"/>
+        <w:jc w:val="start"/>
+        <w:rPr>
+          <w:rFonts w:ascii="Times New Roman" w:hAnsi="Times New Roman"/>
+          <w:sz w:val="24"/>
+          <w:szCs w:val="24"/>
+          <w:lang w:val="es-CO" w:eastAsia="en-US" w:bidi="ar-SA"/>
+        </w:rPr>
+      </w:pPr>
+      <w:r>
+        <w:rPr>
+          <w:sz w:val="24"/>
+          <w:szCs w:val="24"/>
+          <w:lang w:val="es-CO" w:eastAsia="en-US" w:bidi="ar-SA"/>
+        </w:rPr>
       </w:r>
       <w:r>
         <w:br w:type="page"/>
@@ -2802,7 +3223,296 @@
           <w:sz w:val="24"/>
           <w:lang w:val="es-CO" w:eastAsia="en-US" w:bidi="ar-SA"/>
         </w:rPr>
-        <w:t>referencias</w:t>
+        <w:t>Referencias</w:t>
+      </w:r>
+    </w:p>
+    <w:p>
+      <w:pPr>
+        <w:pStyle w:val="Normal"/>
+        <w:widowControl/>
+        <w:suppressAutoHyphens w:val="true"/>
+        <w:bidi w:val="0"/>
+        <w:spacing w:lineRule="auto" w:line="276" w:before="0" w:after="80"/>
+        <w:rPr>
+          <w:rFonts w:ascii="Times New Roman" w:hAnsi="Times New Roman"/>
+          <w:kern w:val="2"/>
+          <w:sz w:val="24"/>
+          <w:lang w:val="es-CO" w:eastAsia="en-US" w:bidi="ar-SA"/>
+        </w:rPr>
+      </w:pPr>
+      <w:r>
+        <w:rPr/>
+      </w:r>
+    </w:p>
+    <w:p>
+      <w:pPr>
+        <w:pStyle w:val="Normal"/>
+        <w:widowControl/>
+        <w:suppressAutoHyphens w:val="true"/>
+        <w:bidi w:val="0"/>
+        <w:spacing w:lineRule="auto" w:line="276" w:before="0" w:after="80"/>
+        <w:rPr>
+          <w:rFonts w:ascii="Times New Roman" w:hAnsi="Times New Roman"/>
+          <w:kern w:val="2"/>
+          <w:sz w:val="24"/>
+          <w:lang w:val="es-CO" w:eastAsia="en-US" w:bidi="ar-SA"/>
+        </w:rPr>
+      </w:pPr>
+      <w:r>
+        <w:rPr/>
+      </w:r>
+    </w:p>
+    <w:p>
+      <w:pPr>
+        <w:pStyle w:val="Normal"/>
+        <w:widowControl/>
+        <w:suppressAutoHyphens w:val="true"/>
+        <w:bidi w:val="0"/>
+        <w:spacing w:lineRule="auto" w:line="276" w:before="0" w:after="80"/>
+        <w:rPr>
+          <w:rFonts w:ascii="Times New Roman" w:hAnsi="Times New Roman"/>
+          <w:kern w:val="2"/>
+          <w:sz w:val="24"/>
+          <w:lang w:val="es-CO" w:eastAsia="en-US" w:bidi="ar-SA"/>
+        </w:rPr>
+      </w:pPr>
+      <w:r>
+        <w:rPr/>
+      </w:r>
+    </w:p>
+    <w:p>
+      <w:pPr>
+        <w:pStyle w:val="Normal"/>
+        <w:widowControl/>
+        <w:suppressAutoHyphens w:val="true"/>
+        <w:bidi w:val="0"/>
+        <w:spacing w:lineRule="auto" w:line="276" w:before="0" w:after="80"/>
+        <w:rPr>
+          <w:rFonts w:ascii="Times New Roman" w:hAnsi="Times New Roman"/>
+          <w:kern w:val="2"/>
+          <w:sz w:val="24"/>
+          <w:lang w:val="es-CO" w:eastAsia="en-US" w:bidi="ar-SA"/>
+        </w:rPr>
+      </w:pPr>
+      <w:r>
+        <w:rPr/>
+      </w:r>
+    </w:p>
+    <w:p>
+      <w:pPr>
+        <w:pStyle w:val="Normal"/>
+        <w:widowControl/>
+        <w:suppressAutoHyphens w:val="true"/>
+        <w:bidi w:val="0"/>
+        <w:spacing w:lineRule="auto" w:line="276" w:before="0" w:after="80"/>
+        <w:rPr>
+          <w:b/>
+          <w:bCs/>
+        </w:rPr>
+      </w:pPr>
+      <w:r>
+        <w:rPr>
+          <w:rFonts w:ascii="Times New Roman" w:hAnsi="Times New Roman"/>
+          <w:b/>
+          <w:bCs/>
+          <w:kern w:val="2"/>
+          <w:sz w:val="24"/>
+          <w:lang w:val="es-CO" w:eastAsia="en-US" w:bidi="ar-SA"/>
+        </w:rPr>
+        <w:t xml:space="preserve"> ​</w:t>
+      </w:r>
+      <w:r>
+        <w:rPr>
+          <w:rFonts w:ascii="Times New Roman" w:hAnsi="Times New Roman"/>
+          <w:b/>
+          <w:bCs/>
+          <w:kern w:val="2"/>
+          <w:sz w:val="24"/>
+          <w:lang w:val="es-CO" w:eastAsia="en-US" w:bidi="ar-SA"/>
+        </w:rPr>
+        <w:t xml:space="preserve">Frontend y Backend: </w:t>
+      </w:r>
+    </w:p>
+    <w:p>
+      <w:pPr>
+        <w:pStyle w:val="Normal"/>
+        <w:widowControl/>
+        <w:suppressAutoHyphens w:val="true"/>
+        <w:bidi w:val="0"/>
+        <w:spacing w:lineRule="auto" w:line="276" w:before="0" w:after="80"/>
+        <w:ind w:hanging="0" w:start="708"/>
+        <w:rPr>
+          <w:rFonts w:ascii="Times New Roman" w:hAnsi="Times New Roman"/>
+          <w:kern w:val="2"/>
+          <w:sz w:val="24"/>
+          <w:lang w:val="es-CO" w:eastAsia="en-US" w:bidi="ar-SA"/>
+        </w:rPr>
+      </w:pPr>
+      <w:r>
+        <w:rPr>
+          <w:rFonts w:ascii="Times New Roman" w:hAnsi="Times New Roman"/>
+          <w:kern w:val="2"/>
+          <w:sz w:val="24"/>
+          <w:lang w:val="es-CO" w:eastAsia="en-US" w:bidi="ar-SA"/>
+        </w:rPr>
+        <w:t>Documentación oficial de React y Spring Boot.</w:t>
+      </w:r>
+    </w:p>
+    <w:p>
+      <w:pPr>
+        <w:pStyle w:val="Normal"/>
+        <w:widowControl/>
+        <w:suppressAutoHyphens w:val="true"/>
+        <w:bidi w:val="0"/>
+        <w:spacing w:lineRule="auto" w:line="276" w:before="0" w:after="80"/>
+        <w:rPr>
+          <w:rFonts w:ascii="Times New Roman" w:hAnsi="Times New Roman"/>
+          <w:kern w:val="2"/>
+          <w:sz w:val="24"/>
+          <w:lang w:val="es-CO" w:eastAsia="en-US" w:bidi="ar-SA"/>
+        </w:rPr>
+      </w:pPr>
+      <w:r>
+        <w:rPr/>
+      </w:r>
+    </w:p>
+    <w:p>
+      <w:pPr>
+        <w:pStyle w:val="Normal"/>
+        <w:widowControl/>
+        <w:suppressAutoHyphens w:val="true"/>
+        <w:bidi w:val="0"/>
+        <w:spacing w:lineRule="auto" w:line="276" w:before="0" w:after="80"/>
+        <w:rPr>
+          <w:rFonts w:ascii="Times New Roman" w:hAnsi="Times New Roman"/>
+          <w:kern w:val="2"/>
+          <w:sz w:val="24"/>
+          <w:lang w:val="es-CO" w:eastAsia="en-US" w:bidi="ar-SA"/>
+        </w:rPr>
+      </w:pPr>
+      <w:r>
+        <w:rPr>
+          <w:rFonts w:ascii="Times New Roman" w:hAnsi="Times New Roman"/>
+          <w:kern w:val="2"/>
+          <w:sz w:val="24"/>
+          <w:lang w:val="es-CO" w:eastAsia="en-US" w:bidi="ar-SA"/>
+        </w:rPr>
+        <w:t>​</w:t>
+      </w:r>
+      <w:r>
+        <w:rPr>
+          <w:rFonts w:ascii="Times New Roman" w:hAnsi="Times New Roman"/>
+          <w:b/>
+          <w:bCs/>
+          <w:kern w:val="2"/>
+          <w:sz w:val="24"/>
+          <w:lang w:val="es-CO" w:eastAsia="en-US" w:bidi="ar-SA"/>
+        </w:rPr>
+        <w:t xml:space="preserve">Tablas: </w:t>
+      </w:r>
+    </w:p>
+    <w:p>
+      <w:pPr>
+        <w:pStyle w:val="Normal"/>
+        <w:widowControl/>
+        <w:suppressAutoHyphens w:val="true"/>
+        <w:bidi w:val="0"/>
+        <w:spacing w:lineRule="auto" w:line="276" w:before="0" w:after="80"/>
+        <w:ind w:hanging="0" w:start="708"/>
+        <w:jc w:val="both"/>
+        <w:rPr>
+          <w:rFonts w:ascii="Times New Roman" w:hAnsi="Times New Roman"/>
+          <w:kern w:val="2"/>
+          <w:sz w:val="24"/>
+          <w:lang w:val="es-CO" w:eastAsia="en-US" w:bidi="ar-SA"/>
+        </w:rPr>
+      </w:pPr>
+      <w:r>
+        <w:rPr>
+          <w:rFonts w:ascii="Times New Roman" w:hAnsi="Times New Roman"/>
+          <w:kern w:val="2"/>
+          <w:sz w:val="24"/>
+          <w:lang w:val="es-CO" w:eastAsia="en-US" w:bidi="ar-SA"/>
+        </w:rPr>
+        <w:t xml:space="preserve">Modelado relacional para las 5 tablas (recetas, categorías, ingredientes, receta_ingrediente, receta_categoria). </w:t>
+      </w:r>
+    </w:p>
+    <w:p>
+      <w:pPr>
+        <w:pStyle w:val="Normal"/>
+        <w:widowControl/>
+        <w:suppressAutoHyphens w:val="true"/>
+        <w:bidi w:val="0"/>
+        <w:spacing w:lineRule="auto" w:line="276" w:before="0" w:after="80"/>
+        <w:rPr>
+          <w:rFonts w:ascii="Times New Roman" w:hAnsi="Times New Roman"/>
+          <w:kern w:val="2"/>
+          <w:sz w:val="24"/>
+          <w:lang w:val="es-CO" w:eastAsia="en-US" w:bidi="ar-SA"/>
+        </w:rPr>
+      </w:pPr>
+      <w:r>
+        <w:rPr/>
+      </w:r>
+    </w:p>
+    <w:p>
+      <w:pPr>
+        <w:pStyle w:val="Normal"/>
+        <w:widowControl/>
+        <w:suppressAutoHyphens w:val="true"/>
+        <w:bidi w:val="0"/>
+        <w:spacing w:lineRule="auto" w:line="276" w:before="0" w:after="80"/>
+        <w:rPr>
+          <w:rFonts w:ascii="Times New Roman" w:hAnsi="Times New Roman"/>
+          <w:kern w:val="2"/>
+          <w:sz w:val="24"/>
+          <w:lang w:val="es-CO" w:eastAsia="en-US" w:bidi="ar-SA"/>
+        </w:rPr>
+      </w:pPr>
+      <w:r>
+        <w:rPr>
+          <w:rFonts w:ascii="Times New Roman" w:hAnsi="Times New Roman"/>
+          <w:kern w:val="2"/>
+          <w:sz w:val="24"/>
+          <w:lang w:val="es-CO" w:eastAsia="en-US" w:bidi="ar-SA"/>
+        </w:rPr>
+        <w:t>​</w:t>
+      </w:r>
+      <w:r>
+        <w:rPr>
+          <w:rFonts w:ascii="Times New Roman" w:hAnsi="Times New Roman"/>
+          <w:b/>
+          <w:bCs/>
+          <w:kern w:val="2"/>
+          <w:sz w:val="24"/>
+          <w:lang w:val="es-CO" w:eastAsia="en-US" w:bidi="ar-SA"/>
+        </w:rPr>
+        <w:t xml:space="preserve">Diagrama: </w:t>
+      </w:r>
+    </w:p>
+    <w:p>
+      <w:pPr>
+        <w:pStyle w:val="Normal"/>
+        <w:widowControl/>
+        <w:suppressAutoHyphens w:val="true"/>
+        <w:bidi w:val="0"/>
+        <w:spacing w:lineRule="auto" w:line="276" w:before="0" w:after="80"/>
+        <w:ind w:hanging="0" w:start="708"/>
+        <w:rPr>
+          <w:rFonts w:ascii="Times New Roman" w:hAnsi="Times New Roman"/>
+          <w:kern w:val="2"/>
+          <w:sz w:val="24"/>
+          <w:lang w:val="es-CO" w:eastAsia="en-US" w:bidi="ar-SA"/>
+        </w:rPr>
+      </w:pPr>
+      <w:r>
+        <w:rPr>
+          <w:rFonts w:ascii="Times New Roman" w:hAnsi="Times New Roman"/>
+          <w:kern w:val="2"/>
+          <w:sz w:val="24"/>
+          <w:lang w:val="es-CO" w:eastAsia="en-US" w:bidi="ar-SA"/>
+        </w:rPr>
+        <w:t>Elaborado en diagrams.net.</w:t>
       </w:r>
     </w:p>
     <w:sectPr>
@@ -3524,6 +4234,1042 @@
     </w:lvl>
   </w:abstractNum>
   <w:abstractNum w:abstractNumId="6">
+    <w:lvl w:ilvl="0">
+      <w:start w:val="1"/>
+      <w:numFmt w:val="bullet"/>
+      <w:lvlText w:val=""/>
+      <w:lvlJc w:val="start"/>
+      <w:pPr>
+        <w:tabs>
+          <w:tab w:val="num" w:pos="709"/>
+        </w:tabs>
+        <w:ind w:start="709" w:hanging="283"/>
+      </w:pPr>
+      <w:rPr>
+        <w:rFonts w:ascii="Symbol" w:hAnsi="Symbol" w:cs="Symbol" w:hint="default"/>
+      </w:rPr>
+    </w:lvl>
+    <w:lvl w:ilvl="1">
+      <w:start w:val="1"/>
+      <w:numFmt w:val="bullet"/>
+      <w:lvlText w:val=""/>
+      <w:lvlJc w:val="start"/>
+      <w:pPr>
+        <w:tabs>
+          <w:tab w:val="num" w:pos="1418"/>
+        </w:tabs>
+        <w:ind w:start="1418" w:hanging="283"/>
+      </w:pPr>
+      <w:rPr>
+        <w:rFonts w:ascii="Symbol" w:hAnsi="Symbol" w:cs="Symbol" w:hint="default"/>
+      </w:rPr>
+    </w:lvl>
+    <w:lvl w:ilvl="2">
+      <w:start w:val="1"/>
+      <w:numFmt w:val="bullet"/>
+      <w:lvlText w:val=""/>
+      <w:lvlJc w:val="start"/>
+      <w:pPr>
+        <w:tabs>
+          <w:tab w:val="num" w:pos="2127"/>
+        </w:tabs>
+        <w:ind w:start="2127" w:hanging="283"/>
+      </w:pPr>
+      <w:rPr>
+        <w:rFonts w:ascii="Symbol" w:hAnsi="Symbol" w:cs="Symbol" w:hint="default"/>
+      </w:rPr>
+    </w:lvl>
+    <w:lvl w:ilvl="3">
+      <w:start w:val="1"/>
+      <w:numFmt w:val="bullet"/>
+      <w:lvlText w:val=""/>
+      <w:lvlJc w:val="start"/>
+      <w:pPr>
+        <w:tabs>
+          <w:tab w:val="num" w:pos="2836"/>
+        </w:tabs>
+        <w:ind w:start="2836" w:hanging="283"/>
+      </w:pPr>
+      <w:rPr>
+        <w:rFonts w:ascii="Symbol" w:hAnsi="Symbol" w:cs="Symbol" w:hint="default"/>
+      </w:rPr>
+    </w:lvl>
+    <w:lvl w:ilvl="4">
+      <w:start w:val="1"/>
+      <w:numFmt w:val="bullet"/>
+      <w:lvlText w:val=""/>
+      <w:lvlJc w:val="start"/>
+      <w:pPr>
+        <w:tabs>
+          <w:tab w:val="num" w:pos="3545"/>
+        </w:tabs>
+        <w:ind w:start="3545" w:hanging="283"/>
+      </w:pPr>
+      <w:rPr>
+        <w:rFonts w:ascii="Symbol" w:hAnsi="Symbol" w:cs="Symbol" w:hint="default"/>
+      </w:rPr>
+    </w:lvl>
+    <w:lvl w:ilvl="5">
+      <w:start w:val="1"/>
+      <w:numFmt w:val="bullet"/>
+      <w:lvlText w:val=""/>
+      <w:lvlJc w:val="start"/>
+      <w:pPr>
+        <w:tabs>
+          <w:tab w:val="num" w:pos="4254"/>
+        </w:tabs>
+        <w:ind w:start="4254" w:hanging="283"/>
+      </w:pPr>
+      <w:rPr>
+        <w:rFonts w:ascii="Symbol" w:hAnsi="Symbol" w:cs="Symbol" w:hint="default"/>
+      </w:rPr>
+    </w:lvl>
+    <w:lvl w:ilvl="6">
+      <w:start w:val="1"/>
+      <w:numFmt w:val="bullet"/>
+      <w:lvlText w:val=""/>
+      <w:lvlJc w:val="start"/>
+      <w:pPr>
+        <w:tabs>
+          <w:tab w:val="num" w:pos="4963"/>
+        </w:tabs>
+        <w:ind w:start="4963" w:hanging="283"/>
+      </w:pPr>
+      <w:rPr>
+        <w:rFonts w:ascii="Symbol" w:hAnsi="Symbol" w:cs="Symbol" w:hint="default"/>
+      </w:rPr>
+    </w:lvl>
+    <w:lvl w:ilvl="7">
+      <w:start w:val="1"/>
+      <w:numFmt w:val="bullet"/>
+      <w:lvlText w:val=""/>
+      <w:lvlJc w:val="start"/>
+      <w:pPr>
+        <w:tabs>
+          <w:tab w:val="num" w:pos="5672"/>
+        </w:tabs>
+        <w:ind w:start="5672" w:hanging="283"/>
+      </w:pPr>
+      <w:rPr>
+        <w:rFonts w:ascii="Symbol" w:hAnsi="Symbol" w:cs="Symbol" w:hint="default"/>
+      </w:rPr>
+    </w:lvl>
+    <w:lvl w:ilvl="8">
+      <w:start w:val="1"/>
+      <w:numFmt w:val="bullet"/>
+      <w:lvlText w:val=""/>
+      <w:lvlJc w:val="start"/>
+      <w:pPr>
+        <w:tabs>
+          <w:tab w:val="num" w:pos="6381"/>
+        </w:tabs>
+        <w:ind w:start="6381" w:hanging="283"/>
+      </w:pPr>
+      <w:rPr>
+        <w:rFonts w:ascii="Symbol" w:hAnsi="Symbol" w:cs="Symbol" w:hint="default"/>
+      </w:rPr>
+    </w:lvl>
+  </w:abstractNum>
+  <w:abstractNum w:abstractNumId="7">
+    <w:lvl w:ilvl="0">
+      <w:start w:val="1"/>
+      <w:numFmt w:val="bullet"/>
+      <w:lvlText w:val=""/>
+      <w:lvlJc w:val="start"/>
+      <w:pPr>
+        <w:tabs>
+          <w:tab w:val="num" w:pos="709"/>
+        </w:tabs>
+        <w:ind w:start="709" w:hanging="283"/>
+      </w:pPr>
+      <w:rPr>
+        <w:rFonts w:ascii="Symbol" w:hAnsi="Symbol" w:cs="Symbol" w:hint="default"/>
+      </w:rPr>
+    </w:lvl>
+    <w:lvl w:ilvl="1">
+      <w:start w:val="1"/>
+      <w:numFmt w:val="bullet"/>
+      <w:lvlText w:val=""/>
+      <w:lvlJc w:val="start"/>
+      <w:pPr>
+        <w:tabs>
+          <w:tab w:val="num" w:pos="1418"/>
+        </w:tabs>
+        <w:ind w:start="1418" w:hanging="283"/>
+      </w:pPr>
+      <w:rPr>
+        <w:rFonts w:ascii="Symbol" w:hAnsi="Symbol" w:cs="Symbol" w:hint="default"/>
+      </w:rPr>
+    </w:lvl>
+    <w:lvl w:ilvl="2">
+      <w:start w:val="1"/>
+      <w:numFmt w:val="bullet"/>
+      <w:lvlText w:val=""/>
+      <w:lvlJc w:val="start"/>
+      <w:pPr>
+        <w:tabs>
+          <w:tab w:val="num" w:pos="2127"/>
+        </w:tabs>
+        <w:ind w:start="2127" w:hanging="283"/>
+      </w:pPr>
+      <w:rPr>
+        <w:rFonts w:ascii="Symbol" w:hAnsi="Symbol" w:cs="Symbol" w:hint="default"/>
+      </w:rPr>
+    </w:lvl>
+    <w:lvl w:ilvl="3">
+      <w:start w:val="1"/>
+      <w:numFmt w:val="bullet"/>
+      <w:lvlText w:val=""/>
+      <w:lvlJc w:val="start"/>
+      <w:pPr>
+        <w:tabs>
+          <w:tab w:val="num" w:pos="2836"/>
+        </w:tabs>
+        <w:ind w:start="2836" w:hanging="283"/>
+      </w:pPr>
+      <w:rPr>
+        <w:rFonts w:ascii="Symbol" w:hAnsi="Symbol" w:cs="Symbol" w:hint="default"/>
+      </w:rPr>
+    </w:lvl>
+    <w:lvl w:ilvl="4">
+      <w:start w:val="1"/>
+      <w:numFmt w:val="bullet"/>
+      <w:lvlText w:val=""/>
+      <w:lvlJc w:val="start"/>
+      <w:pPr>
+        <w:tabs>
+          <w:tab w:val="num" w:pos="3545"/>
+        </w:tabs>
+        <w:ind w:start="3545" w:hanging="283"/>
+      </w:pPr>
+      <w:rPr>
+        <w:rFonts w:ascii="Symbol" w:hAnsi="Symbol" w:cs="Symbol" w:hint="default"/>
+      </w:rPr>
+    </w:lvl>
+    <w:lvl w:ilvl="5">
+      <w:start w:val="1"/>
+      <w:numFmt w:val="bullet"/>
+      <w:lvlText w:val=""/>
+      <w:lvlJc w:val="start"/>
+      <w:pPr>
+        <w:tabs>
+          <w:tab w:val="num" w:pos="4254"/>
+        </w:tabs>
+        <w:ind w:start="4254" w:hanging="283"/>
+      </w:pPr>
+      <w:rPr>
+        <w:rFonts w:ascii="Symbol" w:hAnsi="Symbol" w:cs="Symbol" w:hint="default"/>
+      </w:rPr>
+    </w:lvl>
+    <w:lvl w:ilvl="6">
+      <w:start w:val="1"/>
+      <w:numFmt w:val="bullet"/>
+      <w:lvlText w:val=""/>
+      <w:lvlJc w:val="start"/>
+      <w:pPr>
+        <w:tabs>
+          <w:tab w:val="num" w:pos="4963"/>
+        </w:tabs>
+        <w:ind w:start="4963" w:hanging="283"/>
+      </w:pPr>
+      <w:rPr>
+        <w:rFonts w:ascii="Symbol" w:hAnsi="Symbol" w:cs="Symbol" w:hint="default"/>
+      </w:rPr>
+    </w:lvl>
+    <w:lvl w:ilvl="7">
+      <w:start w:val="1"/>
+      <w:numFmt w:val="bullet"/>
+      <w:lvlText w:val=""/>
+      <w:lvlJc w:val="start"/>
+      <w:pPr>
+        <w:tabs>
+          <w:tab w:val="num" w:pos="5672"/>
+        </w:tabs>
+        <w:ind w:start="5672" w:hanging="283"/>
+      </w:pPr>
+      <w:rPr>
+        <w:rFonts w:ascii="Symbol" w:hAnsi="Symbol" w:cs="Symbol" w:hint="default"/>
+      </w:rPr>
+    </w:lvl>
+    <w:lvl w:ilvl="8">
+      <w:start w:val="1"/>
+      <w:numFmt w:val="bullet"/>
+      <w:lvlText w:val=""/>
+      <w:lvlJc w:val="start"/>
+      <w:pPr>
+        <w:tabs>
+          <w:tab w:val="num" w:pos="6381"/>
+        </w:tabs>
+        <w:ind w:start="6381" w:hanging="283"/>
+      </w:pPr>
+      <w:rPr>
+        <w:rFonts w:ascii="Symbol" w:hAnsi="Symbol" w:cs="Symbol" w:hint="default"/>
+      </w:rPr>
+    </w:lvl>
+  </w:abstractNum>
+  <w:abstractNum w:abstractNumId="8">
+    <w:lvl w:ilvl="0">
+      <w:start w:val="1"/>
+      <w:numFmt w:val="bullet"/>
+      <w:lvlText w:val=""/>
+      <w:lvlJc w:val="start"/>
+      <w:pPr>
+        <w:tabs>
+          <w:tab w:val="num" w:pos="709"/>
+        </w:tabs>
+        <w:ind w:start="709" w:hanging="283"/>
+      </w:pPr>
+      <w:rPr>
+        <w:rFonts w:ascii="Symbol" w:hAnsi="Symbol" w:cs="Symbol" w:hint="default"/>
+      </w:rPr>
+    </w:lvl>
+    <w:lvl w:ilvl="1">
+      <w:start w:val="1"/>
+      <w:numFmt w:val="bullet"/>
+      <w:lvlText w:val=""/>
+      <w:lvlJc w:val="start"/>
+      <w:pPr>
+        <w:tabs>
+          <w:tab w:val="num" w:pos="1418"/>
+        </w:tabs>
+        <w:ind w:start="1418" w:hanging="283"/>
+      </w:pPr>
+      <w:rPr>
+        <w:rFonts w:ascii="Symbol" w:hAnsi="Symbol" w:cs="Symbol" w:hint="default"/>
+      </w:rPr>
+    </w:lvl>
+    <w:lvl w:ilvl="2">
+      <w:start w:val="1"/>
+      <w:numFmt w:val="bullet"/>
+      <w:lvlText w:val=""/>
+      <w:lvlJc w:val="start"/>
+      <w:pPr>
+        <w:tabs>
+          <w:tab w:val="num" w:pos="2127"/>
+        </w:tabs>
+        <w:ind w:start="2127" w:hanging="283"/>
+      </w:pPr>
+      <w:rPr>
+        <w:rFonts w:ascii="Symbol" w:hAnsi="Symbol" w:cs="Symbol" w:hint="default"/>
+      </w:rPr>
+    </w:lvl>
+    <w:lvl w:ilvl="3">
+      <w:start w:val="1"/>
+      <w:numFmt w:val="bullet"/>
+      <w:lvlText w:val=""/>
+      <w:lvlJc w:val="start"/>
+      <w:pPr>
+        <w:tabs>
+          <w:tab w:val="num" w:pos="2836"/>
+        </w:tabs>
+        <w:ind w:start="2836" w:hanging="283"/>
+      </w:pPr>
+      <w:rPr>
+        <w:rFonts w:ascii="Symbol" w:hAnsi="Symbol" w:cs="Symbol" w:hint="default"/>
+      </w:rPr>
+    </w:lvl>
+    <w:lvl w:ilvl="4">
+      <w:start w:val="1"/>
+      <w:numFmt w:val="bullet"/>
+      <w:lvlText w:val=""/>
+      <w:lvlJc w:val="start"/>
+      <w:pPr>
+        <w:tabs>
+          <w:tab w:val="num" w:pos="3545"/>
+        </w:tabs>
+        <w:ind w:start="3545" w:hanging="283"/>
+      </w:pPr>
+      <w:rPr>
+        <w:rFonts w:ascii="Symbol" w:hAnsi="Symbol" w:cs="Symbol" w:hint="default"/>
+      </w:rPr>
+    </w:lvl>
+    <w:lvl w:ilvl="5">
+      <w:start w:val="1"/>
+      <w:numFmt w:val="bullet"/>
+      <w:lvlText w:val=""/>
+      <w:lvlJc w:val="start"/>
+      <w:pPr>
+        <w:tabs>
+          <w:tab w:val="num" w:pos="4254"/>
+        </w:tabs>
+        <w:ind w:start="4254" w:hanging="283"/>
+      </w:pPr>
+      <w:rPr>
+        <w:rFonts w:ascii="Symbol" w:hAnsi="Symbol" w:cs="Symbol" w:hint="default"/>
+      </w:rPr>
+    </w:lvl>
+    <w:lvl w:ilvl="6">
+      <w:start w:val="1"/>
+      <w:numFmt w:val="bullet"/>
+      <w:lvlText w:val=""/>
+      <w:lvlJc w:val="start"/>
+      <w:pPr>
+        <w:tabs>
+          <w:tab w:val="num" w:pos="4963"/>
+        </w:tabs>
+        <w:ind w:start="4963" w:hanging="283"/>
+      </w:pPr>
+      <w:rPr>
+        <w:rFonts w:ascii="Symbol" w:hAnsi="Symbol" w:cs="Symbol" w:hint="default"/>
+      </w:rPr>
+    </w:lvl>
+    <w:lvl w:ilvl="7">
+      <w:start w:val="1"/>
+      <w:numFmt w:val="bullet"/>
+      <w:lvlText w:val=""/>
+      <w:lvlJc w:val="start"/>
+      <w:pPr>
+        <w:tabs>
+          <w:tab w:val="num" w:pos="5672"/>
+        </w:tabs>
+        <w:ind w:start="5672" w:hanging="283"/>
+      </w:pPr>
+      <w:rPr>
+        <w:rFonts w:ascii="Symbol" w:hAnsi="Symbol" w:cs="Symbol" w:hint="default"/>
+      </w:rPr>
+    </w:lvl>
+    <w:lvl w:ilvl="8">
+      <w:start w:val="1"/>
+      <w:numFmt w:val="bullet"/>
+      <w:lvlText w:val=""/>
+      <w:lvlJc w:val="start"/>
+      <w:pPr>
+        <w:tabs>
+          <w:tab w:val="num" w:pos="6381"/>
+        </w:tabs>
+        <w:ind w:start="6381" w:hanging="283"/>
+      </w:pPr>
+      <w:rPr>
+        <w:rFonts w:ascii="Symbol" w:hAnsi="Symbol" w:cs="Symbol" w:hint="default"/>
+      </w:rPr>
+    </w:lvl>
+  </w:abstractNum>
+  <w:abstractNum w:abstractNumId="9">
+    <w:lvl w:ilvl="0">
+      <w:start w:val="1"/>
+      <w:numFmt w:val="bullet"/>
+      <w:lvlText w:val=""/>
+      <w:lvlJc w:val="start"/>
+      <w:pPr>
+        <w:tabs>
+          <w:tab w:val="num" w:pos="720"/>
+        </w:tabs>
+        <w:ind w:start="720" w:hanging="283"/>
+      </w:pPr>
+      <w:rPr>
+        <w:rFonts w:ascii="Symbol" w:hAnsi="Symbol" w:cs="Symbol" w:hint="default"/>
+      </w:rPr>
+    </w:lvl>
+    <w:lvl w:ilvl="1">
+      <w:start w:val="1"/>
+      <w:numFmt w:val="decimal"/>
+      <w:lvlText w:val="%2."/>
+      <w:lvlJc w:val="start"/>
+      <w:pPr>
+        <w:tabs>
+          <w:tab w:val="num" w:pos="1080"/>
+        </w:tabs>
+        <w:ind w:start="1080" w:hanging="360"/>
+      </w:pPr>
+    </w:lvl>
+    <w:lvl w:ilvl="2">
+      <w:start w:val="1"/>
+      <w:numFmt w:val="decimal"/>
+      <w:lvlText w:val="%3."/>
+      <w:lvlJc w:val="start"/>
+      <w:pPr>
+        <w:tabs>
+          <w:tab w:val="num" w:pos="1440"/>
+        </w:tabs>
+        <w:ind w:start="1440" w:hanging="360"/>
+      </w:pPr>
+    </w:lvl>
+    <w:lvl w:ilvl="3">
+      <w:start w:val="1"/>
+      <w:numFmt w:val="decimal"/>
+      <w:lvlText w:val="%4."/>
+      <w:lvlJc w:val="start"/>
+      <w:pPr>
+        <w:tabs>
+          <w:tab w:val="num" w:pos="1800"/>
+        </w:tabs>
+        <w:ind w:start="1800" w:hanging="360"/>
+      </w:pPr>
+    </w:lvl>
+    <w:lvl w:ilvl="4">
+      <w:start w:val="1"/>
+      <w:numFmt w:val="decimal"/>
+      <w:lvlText w:val="%5."/>
+      <w:lvlJc w:val="start"/>
+      <w:pPr>
+        <w:tabs>
+          <w:tab w:val="num" w:pos="2160"/>
+        </w:tabs>
+        <w:ind w:start="2160" w:hanging="360"/>
+      </w:pPr>
+    </w:lvl>
+    <w:lvl w:ilvl="5">
+      <w:start w:val="1"/>
+      <w:numFmt w:val="decimal"/>
+      <w:lvlText w:val="%6."/>
+      <w:lvlJc w:val="start"/>
+      <w:pPr>
+        <w:tabs>
+          <w:tab w:val="num" w:pos="2520"/>
+        </w:tabs>
+        <w:ind w:start="2520" w:hanging="360"/>
+      </w:pPr>
+    </w:lvl>
+    <w:lvl w:ilvl="6">
+      <w:start w:val="1"/>
+      <w:numFmt w:val="decimal"/>
+      <w:lvlText w:val="%7."/>
+      <w:lvlJc w:val="start"/>
+      <w:pPr>
+        <w:tabs>
+          <w:tab w:val="num" w:pos="2880"/>
+        </w:tabs>
+        <w:ind w:start="2880" w:hanging="360"/>
+      </w:pPr>
+    </w:lvl>
+    <w:lvl w:ilvl="7">
+      <w:start w:val="1"/>
+      <w:numFmt w:val="decimal"/>
+      <w:lvlText w:val="%8."/>
+      <w:lvlJc w:val="start"/>
+      <w:pPr>
+        <w:tabs>
+          <w:tab w:val="num" w:pos="3240"/>
+        </w:tabs>
+        <w:ind w:start="3240" w:hanging="360"/>
+      </w:pPr>
+    </w:lvl>
+    <w:lvl w:ilvl="8">
+      <w:start w:val="1"/>
+      <w:numFmt w:val="decimal"/>
+      <w:lvlText w:val="%9."/>
+      <w:lvlJc w:val="start"/>
+      <w:pPr>
+        <w:tabs>
+          <w:tab w:val="num" w:pos="3600"/>
+        </w:tabs>
+        <w:ind w:start="3600" w:hanging="360"/>
+      </w:pPr>
+    </w:lvl>
+  </w:abstractNum>
+  <w:abstractNum w:abstractNumId="10">
+    <w:lvl w:ilvl="0">
+      <w:start w:val="1"/>
+      <w:numFmt w:val="bullet"/>
+      <w:lvlText w:val=""/>
+      <w:lvlJc w:val="start"/>
+      <w:pPr>
+        <w:tabs>
+          <w:tab w:val="num" w:pos="709"/>
+        </w:tabs>
+        <w:ind w:start="709" w:hanging="283"/>
+      </w:pPr>
+      <w:rPr>
+        <w:rFonts w:ascii="Symbol" w:hAnsi="Symbol" w:cs="Symbol" w:hint="default"/>
+      </w:rPr>
+    </w:lvl>
+    <w:lvl w:ilvl="1">
+      <w:start w:val="1"/>
+      <w:numFmt w:val="bullet"/>
+      <w:lvlText w:val=""/>
+      <w:lvlJc w:val="start"/>
+      <w:pPr>
+        <w:tabs>
+          <w:tab w:val="num" w:pos="1418"/>
+        </w:tabs>
+        <w:ind w:start="1418" w:hanging="283"/>
+      </w:pPr>
+      <w:rPr>
+        <w:rFonts w:ascii="Symbol" w:hAnsi="Symbol" w:cs="Symbol" w:hint="default"/>
+      </w:rPr>
+    </w:lvl>
+    <w:lvl w:ilvl="2">
+      <w:start w:val="1"/>
+      <w:numFmt w:val="bullet"/>
+      <w:lvlText w:val=""/>
+      <w:lvlJc w:val="start"/>
+      <w:pPr>
+        <w:tabs>
+          <w:tab w:val="num" w:pos="2127"/>
+        </w:tabs>
+        <w:ind w:start="2127" w:hanging="283"/>
+      </w:pPr>
+      <w:rPr>
+        <w:rFonts w:ascii="Symbol" w:hAnsi="Symbol" w:cs="Symbol" w:hint="default"/>
+      </w:rPr>
+    </w:lvl>
+    <w:lvl w:ilvl="3">
+      <w:start w:val="1"/>
+      <w:numFmt w:val="bullet"/>
+      <w:lvlText w:val=""/>
+      <w:lvlJc w:val="start"/>
+      <w:pPr>
+        <w:tabs>
+          <w:tab w:val="num" w:pos="2836"/>
+        </w:tabs>
+        <w:ind w:start="2836" w:hanging="283"/>
+      </w:pPr>
+      <w:rPr>
+        <w:rFonts w:ascii="Symbol" w:hAnsi="Symbol" w:cs="Symbol" w:hint="default"/>
+      </w:rPr>
+    </w:lvl>
+    <w:lvl w:ilvl="4">
+      <w:start w:val="1"/>
+      <w:numFmt w:val="bullet"/>
+      <w:lvlText w:val=""/>
+      <w:lvlJc w:val="start"/>
+      <w:pPr>
+        <w:tabs>
+          <w:tab w:val="num" w:pos="3545"/>
+        </w:tabs>
+        <w:ind w:start="3545" w:hanging="283"/>
+      </w:pPr>
+      <w:rPr>
+        <w:rFonts w:ascii="Symbol" w:hAnsi="Symbol" w:cs="Symbol" w:hint="default"/>
+      </w:rPr>
+    </w:lvl>
+    <w:lvl w:ilvl="5">
+      <w:start w:val="1"/>
+      <w:numFmt w:val="bullet"/>
+      <w:lvlText w:val=""/>
+      <w:lvlJc w:val="start"/>
+      <w:pPr>
+        <w:tabs>
+          <w:tab w:val="num" w:pos="4254"/>
+        </w:tabs>
+        <w:ind w:start="4254" w:hanging="283"/>
+      </w:pPr>
+      <w:rPr>
+        <w:rFonts w:ascii="Symbol" w:hAnsi="Symbol" w:cs="Symbol" w:hint="default"/>
+      </w:rPr>
+    </w:lvl>
+    <w:lvl w:ilvl="6">
+      <w:start w:val="1"/>
+      <w:numFmt w:val="bullet"/>
+      <w:lvlText w:val=""/>
+      <w:lvlJc w:val="start"/>
+      <w:pPr>
+        <w:tabs>
+          <w:tab w:val="num" w:pos="4963"/>
+        </w:tabs>
+        <w:ind w:start="4963" w:hanging="283"/>
+      </w:pPr>
+      <w:rPr>
+        <w:rFonts w:ascii="Symbol" w:hAnsi="Symbol" w:cs="Symbol" w:hint="default"/>
+      </w:rPr>
+    </w:lvl>
+    <w:lvl w:ilvl="7">
+      <w:start w:val="1"/>
+      <w:numFmt w:val="bullet"/>
+      <w:lvlText w:val=""/>
+      <w:lvlJc w:val="start"/>
+      <w:pPr>
+        <w:tabs>
+          <w:tab w:val="num" w:pos="5672"/>
+        </w:tabs>
+        <w:ind w:start="5672" w:hanging="283"/>
+      </w:pPr>
+      <w:rPr>
+        <w:rFonts w:ascii="Symbol" w:hAnsi="Symbol" w:cs="Symbol" w:hint="default"/>
+      </w:rPr>
+    </w:lvl>
+    <w:lvl w:ilvl="8">
+      <w:start w:val="1"/>
+      <w:numFmt w:val="bullet"/>
+      <w:lvlText w:val=""/>
+      <w:lvlJc w:val="start"/>
+      <w:pPr>
+        <w:tabs>
+          <w:tab w:val="num" w:pos="6381"/>
+        </w:tabs>
+        <w:ind w:start="6381" w:hanging="283"/>
+      </w:pPr>
+      <w:rPr>
+        <w:rFonts w:ascii="Symbol" w:hAnsi="Symbol" w:cs="Symbol" w:hint="default"/>
+      </w:rPr>
+    </w:lvl>
+  </w:abstractNum>
+  <w:abstractNum w:abstractNumId="11">
+    <w:lvl w:ilvl="0">
+      <w:start w:val="1"/>
+      <w:numFmt w:val="bullet"/>
+      <w:lvlText w:val=""/>
+      <w:lvlJc w:val="start"/>
+      <w:pPr>
+        <w:tabs>
+          <w:tab w:val="num" w:pos="709"/>
+        </w:tabs>
+        <w:ind w:start="709" w:hanging="283"/>
+      </w:pPr>
+      <w:rPr>
+        <w:rFonts w:ascii="Symbol" w:hAnsi="Symbol" w:cs="Symbol" w:hint="default"/>
+      </w:rPr>
+    </w:lvl>
+    <w:lvl w:ilvl="1">
+      <w:start w:val="1"/>
+      <w:numFmt w:val="bullet"/>
+      <w:lvlText w:val=""/>
+      <w:lvlJc w:val="start"/>
+      <w:pPr>
+        <w:tabs>
+          <w:tab w:val="num" w:pos="1418"/>
+        </w:tabs>
+        <w:ind w:start="1418" w:hanging="283"/>
+      </w:pPr>
+      <w:rPr>
+        <w:rFonts w:ascii="Symbol" w:hAnsi="Symbol" w:cs="Symbol" w:hint="default"/>
+      </w:rPr>
+    </w:lvl>
+    <w:lvl w:ilvl="2">
+      <w:start w:val="1"/>
+      <w:numFmt w:val="bullet"/>
+      <w:lvlText w:val=""/>
+      <w:lvlJc w:val="start"/>
+      <w:pPr>
+        <w:tabs>
+          <w:tab w:val="num" w:pos="2127"/>
+        </w:tabs>
+        <w:ind w:start="2127" w:hanging="283"/>
+      </w:pPr>
+      <w:rPr>
+        <w:rFonts w:ascii="Symbol" w:hAnsi="Symbol" w:cs="Symbol" w:hint="default"/>
+      </w:rPr>
+    </w:lvl>
+    <w:lvl w:ilvl="3">
+      <w:start w:val="1"/>
+      <w:numFmt w:val="bullet"/>
+      <w:lvlText w:val=""/>
+      <w:lvlJc w:val="start"/>
+      <w:pPr>
+        <w:tabs>
+          <w:tab w:val="num" w:pos="2836"/>
+        </w:tabs>
+        <w:ind w:start="2836" w:hanging="283"/>
+      </w:pPr>
+      <w:rPr>
+        <w:rFonts w:ascii="Symbol" w:hAnsi="Symbol" w:cs="Symbol" w:hint="default"/>
+      </w:rPr>
+    </w:lvl>
+    <w:lvl w:ilvl="4">
+      <w:start w:val="1"/>
+      <w:numFmt w:val="bullet"/>
+      <w:lvlText w:val=""/>
+      <w:lvlJc w:val="start"/>
+      <w:pPr>
+        <w:tabs>
+          <w:tab w:val="num" w:pos="3545"/>
+        </w:tabs>
+        <w:ind w:start="3545" w:hanging="283"/>
+      </w:pPr>
+      <w:rPr>
+        <w:rFonts w:ascii="Symbol" w:hAnsi="Symbol" w:cs="Symbol" w:hint="default"/>
+      </w:rPr>
+    </w:lvl>
+    <w:lvl w:ilvl="5">
+      <w:start w:val="1"/>
+      <w:numFmt w:val="bullet"/>
+      <w:lvlText w:val=""/>
+      <w:lvlJc w:val="start"/>
+      <w:pPr>
+        <w:tabs>
+          <w:tab w:val="num" w:pos="4254"/>
+        </w:tabs>
+        <w:ind w:start="4254" w:hanging="283"/>
+      </w:pPr>
+      <w:rPr>
+        <w:rFonts w:ascii="Symbol" w:hAnsi="Symbol" w:cs="Symbol" w:hint="default"/>
+      </w:rPr>
+    </w:lvl>
+    <w:lvl w:ilvl="6">
+      <w:start w:val="1"/>
+      <w:numFmt w:val="bullet"/>
+      <w:lvlText w:val=""/>
+      <w:lvlJc w:val="start"/>
+      <w:pPr>
+        <w:tabs>
+          <w:tab w:val="num" w:pos="4963"/>
+        </w:tabs>
+        <w:ind w:start="4963" w:hanging="283"/>
+      </w:pPr>
+      <w:rPr>
+        <w:rFonts w:ascii="Symbol" w:hAnsi="Symbol" w:cs="Symbol" w:hint="default"/>
+      </w:rPr>
+    </w:lvl>
+    <w:lvl w:ilvl="7">
+      <w:start w:val="1"/>
+      <w:numFmt w:val="bullet"/>
+      <w:lvlText w:val=""/>
+      <w:lvlJc w:val="start"/>
+      <w:pPr>
+        <w:tabs>
+          <w:tab w:val="num" w:pos="5672"/>
+        </w:tabs>
+        <w:ind w:start="5672" w:hanging="283"/>
+      </w:pPr>
+      <w:rPr>
+        <w:rFonts w:ascii="Symbol" w:hAnsi="Symbol" w:cs="Symbol" w:hint="default"/>
+      </w:rPr>
+    </w:lvl>
+    <w:lvl w:ilvl="8">
+      <w:start w:val="1"/>
+      <w:numFmt w:val="bullet"/>
+      <w:lvlText w:val=""/>
+      <w:lvlJc w:val="start"/>
+      <w:pPr>
+        <w:tabs>
+          <w:tab w:val="num" w:pos="6381"/>
+        </w:tabs>
+        <w:ind w:start="6381" w:hanging="283"/>
+      </w:pPr>
+      <w:rPr>
+        <w:rFonts w:ascii="Symbol" w:hAnsi="Symbol" w:cs="Symbol" w:hint="default"/>
+      </w:rPr>
+    </w:lvl>
+  </w:abstractNum>
+  <w:abstractNum w:abstractNumId="12">
+    <w:lvl w:ilvl="0">
+      <w:start w:val="1"/>
+      <w:numFmt w:val="decimal"/>
+      <w:lvlText w:val="%1."/>
+      <w:lvlJc w:val="start"/>
+      <w:pPr>
+        <w:tabs>
+          <w:tab w:val="num" w:pos="1080"/>
+        </w:tabs>
+        <w:ind w:start="1080" w:hanging="360"/>
+      </w:pPr>
+      <w:rPr/>
+    </w:lvl>
+    <w:lvl w:ilvl="1">
+      <w:start w:val="1"/>
+      <w:numFmt w:val="decimal"/>
+      <w:lvlText w:val="%2."/>
+      <w:lvlJc w:val="start"/>
+      <w:pPr>
+        <w:tabs>
+          <w:tab w:val="num" w:pos="1440"/>
+        </w:tabs>
+        <w:ind w:start="1440" w:hanging="360"/>
+      </w:pPr>
+      <w:rPr/>
+    </w:lvl>
+    <w:lvl w:ilvl="2">
+      <w:start w:val="1"/>
+      <w:numFmt w:val="decimal"/>
+      <w:lvlText w:val="%3."/>
+      <w:lvlJc w:val="start"/>
+      <w:pPr>
+        <w:tabs>
+          <w:tab w:val="num" w:pos="1800"/>
+        </w:tabs>
+        <w:ind w:start="1800" w:hanging="360"/>
+      </w:pPr>
+      <w:rPr/>
+    </w:lvl>
+    <w:lvl w:ilvl="3">
+      <w:start w:val="1"/>
+      <w:numFmt w:val="decimal"/>
+      <w:lvlText w:val="%4."/>
+      <w:lvlJc w:val="start"/>
+      <w:pPr>
+        <w:tabs>
+          <w:tab w:val="num" w:pos="2160"/>
+        </w:tabs>
+        <w:ind w:start="2160" w:hanging="360"/>
+      </w:pPr>
+      <w:rPr/>
+    </w:lvl>
+    <w:lvl w:ilvl="4">
+      <w:start w:val="1"/>
+      <w:numFmt w:val="decimal"/>
+      <w:lvlText w:val="%5."/>
+      <w:lvlJc w:val="start"/>
+      <w:pPr>
+        <w:tabs>
+          <w:tab w:val="num" w:pos="2520"/>
+        </w:tabs>
+        <w:ind w:start="2520" w:hanging="360"/>
+      </w:pPr>
+      <w:rPr/>
+    </w:lvl>
+    <w:lvl w:ilvl="5">
+      <w:start w:val="1"/>
+      <w:numFmt w:val="decimal"/>
+      <w:lvlText w:val="%6."/>
+      <w:lvlJc w:val="start"/>
+      <w:pPr>
+        <w:tabs>
+          <w:tab w:val="num" w:pos="2880"/>
+        </w:tabs>
+        <w:ind w:start="2880" w:hanging="360"/>
+      </w:pPr>
+      <w:rPr/>
+    </w:lvl>
+    <w:lvl w:ilvl="6">
+      <w:start w:val="1"/>
+      <w:numFmt w:val="decimal"/>
+      <w:lvlText w:val="%7."/>
+      <w:lvlJc w:val="start"/>
+      <w:pPr>
+        <w:tabs>
+          <w:tab w:val="num" w:pos="3240"/>
+        </w:tabs>
+        <w:ind w:start="3240" w:hanging="360"/>
+      </w:pPr>
+      <w:rPr/>
+    </w:lvl>
+    <w:lvl w:ilvl="7">
+      <w:start w:val="1"/>
+      <w:numFmt w:val="decimal"/>
+      <w:lvlText w:val="%8."/>
+      <w:lvlJc w:val="start"/>
+      <w:pPr>
+        <w:tabs>
+          <w:tab w:val="num" w:pos="3600"/>
+        </w:tabs>
+        <w:ind w:start="3600" w:hanging="360"/>
+      </w:pPr>
+      <w:rPr/>
+    </w:lvl>
+    <w:lvl w:ilvl="8">
+      <w:start w:val="1"/>
+      <w:numFmt w:val="decimal"/>
+      <w:lvlText w:val="%9."/>
+      <w:lvlJc w:val="start"/>
+      <w:pPr>
+        <w:tabs>
+          <w:tab w:val="num" w:pos="3960"/>
+        </w:tabs>
+        <w:ind w:start="3960" w:hanging="360"/>
+      </w:pPr>
+      <w:rPr/>
+    </w:lvl>
+  </w:abstractNum>
+  <w:abstractNum w:abstractNumId="13">
+    <w:lvl w:ilvl="0">
+      <w:start w:val="1"/>
+      <w:numFmt w:val="decimal"/>
+      <w:lvlText w:val="%1."/>
+      <w:lvlJc w:val="start"/>
+      <w:pPr>
+        <w:tabs>
+          <w:tab w:val="num" w:pos="720"/>
+        </w:tabs>
+        <w:ind w:start="720" w:hanging="360"/>
+      </w:pPr>
+      <w:rPr/>
+    </w:lvl>
+    <w:lvl w:ilvl="1">
+      <w:start w:val="1"/>
+      <w:numFmt w:val="decimal"/>
+      <w:lvlText w:val="%2."/>
+      <w:lvlJc w:val="start"/>
+      <w:pPr>
+        <w:tabs>
+          <w:tab w:val="num" w:pos="1080"/>
+        </w:tabs>
+        <w:ind w:start="1080" w:hanging="360"/>
+      </w:pPr>
+      <w:rPr/>
+    </w:lvl>
+    <w:lvl w:ilvl="2">
+      <w:start w:val="1"/>
+      <w:numFmt w:val="decimal"/>
+      <w:lvlText w:val="%3."/>
+      <w:lvlJc w:val="start"/>
+      <w:pPr>
+        <w:tabs>
+          <w:tab w:val="num" w:pos="1440"/>
+        </w:tabs>
+        <w:ind w:start="1440" w:hanging="360"/>
+      </w:pPr>
+      <w:rPr/>
+    </w:lvl>
+    <w:lvl w:ilvl="3">
+      <w:start w:val="1"/>
+      <w:numFmt w:val="decimal"/>
+      <w:lvlText w:val="%4."/>
+      <w:lvlJc w:val="start"/>
+      <w:pPr>
+        <w:tabs>
+          <w:tab w:val="num" w:pos="1800"/>
+        </w:tabs>
+        <w:ind w:start="1800" w:hanging="360"/>
+      </w:pPr>
+      <w:rPr/>
+    </w:lvl>
+    <w:lvl w:ilvl="4">
+      <w:start w:val="1"/>
+      <w:numFmt w:val="decimal"/>
+      <w:lvlText w:val="%5."/>
+      <w:lvlJc w:val="start"/>
+      <w:pPr>
+        <w:tabs>
+          <w:tab w:val="num" w:pos="2160"/>
+        </w:tabs>
+        <w:ind w:start="2160" w:hanging="360"/>
+      </w:pPr>
+      <w:rPr/>
+    </w:lvl>
+    <w:lvl w:ilvl="5">
+      <w:start w:val="1"/>
+      <w:numFmt w:val="decimal"/>
+      <w:lvlText w:val="%6."/>
+      <w:lvlJc w:val="start"/>
+      <w:pPr>
+        <w:tabs>
+          <w:tab w:val="num" w:pos="2520"/>
+        </w:tabs>
+        <w:ind w:start="2520" w:hanging="360"/>
+      </w:pPr>
+      <w:rPr/>
+    </w:lvl>
+    <w:lvl w:ilvl="6">
+      <w:start w:val="1"/>
+      <w:numFmt w:val="decimal"/>
+      <w:lvlText w:val="%7."/>
+      <w:lvlJc w:val="start"/>
+      <w:pPr>
+        <w:tabs>
+          <w:tab w:val="num" w:pos="2880"/>
+        </w:tabs>
+        <w:ind w:start="2880" w:hanging="360"/>
+      </w:pPr>
+      <w:rPr/>
+    </w:lvl>
+    <w:lvl w:ilvl="7">
+      <w:start w:val="1"/>
+      <w:numFmt w:val="decimal"/>
+      <w:lvlText w:val="%8."/>
+      <w:lvlJc w:val="start"/>
+      <w:pPr>
+        <w:tabs>
+          <w:tab w:val="num" w:pos="3240"/>
+        </w:tabs>
+        <w:ind w:start="3240" w:hanging="360"/>
+      </w:pPr>
+      <w:rPr/>
+    </w:lvl>
+    <w:lvl w:ilvl="8">
+      <w:start w:val="1"/>
+      <w:numFmt w:val="decimal"/>
+      <w:lvlText w:val="%9."/>
+      <w:lvlJc w:val="start"/>
+      <w:pPr>
+        <w:tabs>
+          <w:tab w:val="num" w:pos="3600"/>
+        </w:tabs>
+        <w:ind w:start="3600" w:hanging="360"/>
+      </w:pPr>
+      <w:rPr/>
+    </w:lvl>
+  </w:abstractNum>
+  <w:abstractNum w:abstractNumId="14">
     <w:lvl w:ilvl="0">
       <w:start w:val="1"/>
       <w:numFmt w:val="none"/>
@@ -3659,6 +5405,30 @@
   </w:num>
   <w:num w:numId="6">
     <w:abstractNumId w:val="6"/>
+  </w:num>
+  <w:num w:numId="7">
+    <w:abstractNumId w:val="7"/>
+  </w:num>
+  <w:num w:numId="8">
+    <w:abstractNumId w:val="8"/>
+  </w:num>
+  <w:num w:numId="9">
+    <w:abstractNumId w:val="9"/>
+  </w:num>
+  <w:num w:numId="10">
+    <w:abstractNumId w:val="10"/>
+  </w:num>
+  <w:num w:numId="11">
+    <w:abstractNumId w:val="11"/>
+  </w:num>
+  <w:num w:numId="12">
+    <w:abstractNumId w:val="12"/>
+  </w:num>
+  <w:num w:numId="13">
+    <w:abstractNumId w:val="13"/>
+  </w:num>
+  <w:num w:numId="14">
+    <w:abstractNumId w:val="14"/>
   </w:num>
 </w:numbering>
 </file>
@@ -4529,6 +6299,11 @@
       <w14:ligatures w14:val="none"/>
     </w:rPr>
   </w:style>
+  <w:style w:type="character" w:styleId="Smbolosdenumeracin">
+    <w:name w:val="Símbolos de numeración"/>
+    <w:qFormat/>
+    <w:rPr/>
+  </w:style>
   <w:style w:type="paragraph" w:styleId="Ttulo">
     <w:name w:val="Título"/>
     <w:basedOn w:val="Normal"/>
@@ -4781,6 +6556,8 @@
     </w:pPr>
     <w:rPr>
       <w:rFonts w:eastAsia="Times New Roman" w:cs="Arial"/>
+      <w:b w:val="false"/>
+      <w:bCs w:val="false"/>
       <w:color w:val="000000"/>
       <w:kern w:val="0"/>
       <w14:ligatures w14:val="none"/>

</xml_diff>

<commit_message>
docs Ajuste de formato y eliminacion de plantilla
</commit_message>
<xml_diff>
--- a/Informe-celula-2.docx
+++ b/Informe-celula-2.docx
@@ -727,13 +727,7 @@
             <w:rPr>
               <w:rFonts w:ascii="Times New Roman" w:hAnsi="Times New Roman"/>
             </w:rPr>
-            <w:t>Gestión d</w:t>
-          </w:r>
-          <w:r>
-            <w:rPr>
-              <w:rFonts w:ascii="Times New Roman" w:hAnsi="Times New Roman"/>
-            </w:rPr>
-            <w:t>e estados y persistencia.</w:t>
+            <w:t>Gestión de estados y persistencia.</w:t>
           </w:r>
           <w:hyperlink w:anchor="_Toc241862474">
             <w:r>
@@ -1050,13 +1044,7 @@
               <w:rPr>
                 <w:webHidden/>
               </w:rPr>
-              <w:instrText>PAGEREF</w:instrText>
-            </w:r>
-            <w:r>
-              <w:rPr>
-                <w:webHidden/>
-              </w:rPr>
-              <w:instrText xml:space="preserve"> _Toc241862481 \h</w:instrText>
+              <w:instrText>PAGEREF _Toc241862481 \h</w:instrText>
             </w:r>
             <w:r>
               <w:rPr>
@@ -1219,7 +1207,21 @@
             <w:rPr>
               <w:rFonts w:ascii="Times New Roman" w:hAnsi="Times New Roman"/>
             </w:rPr>
-            <w:t>referencias………………………………………………………………………………….18</w:t>
+            <w:t>referencias……………………………………………………………………………</w:t>
+          </w:r>
+          <w:proofErr w:type="gramStart"/>
+          <w:r>
+            <w:rPr>
+              <w:rFonts w:ascii="Times New Roman" w:hAnsi="Times New Roman"/>
+            </w:rPr>
+            <w:t>…….</w:t>
+          </w:r>
+          <w:proofErr w:type="gramEnd"/>
+          <w:r>
+            <w:rPr>
+              <w:rFonts w:ascii="Times New Roman" w:hAnsi="Times New Roman"/>
+            </w:rPr>
+            <w:t>18</w:t>
           </w:r>
           <w:r>
             <w:rPr>
@@ -1234,122 +1236,6 @@
       <w:pPr>
         <w:pStyle w:val="Ttulo1"/>
         <w:spacing w:before="0"/>
-      </w:pPr>
-      <w:r>
-        <w:br w:type="page"/>
-      </w:r>
-      <w:bookmarkStart w:id="0" w:name="_Toc241862472"/>
-      <w:proofErr w:type="spellStart"/>
-      <w:r>
-        <w:rPr>
-          <w:lang w:val="en-US"/>
-        </w:rPr>
-        <w:lastRenderedPageBreak/>
-        <w:t>Listado</w:t>
-      </w:r>
-      <w:proofErr w:type="spellEnd"/>
-      <w:r>
-        <w:rPr>
-          <w:lang w:val="en-US"/>
-        </w:rPr>
-        <w:t xml:space="preserve"> de </w:t>
-      </w:r>
-      <w:proofErr w:type="spellStart"/>
-      <w:r>
-        <w:rPr>
-          <w:lang w:val="en-US"/>
-        </w:rPr>
-        <w:t>tablas</w:t>
-      </w:r>
-      <w:bookmarkEnd w:id="0"/>
-      <w:proofErr w:type="spellEnd"/>
-    </w:p>
-    <w:p>
-      <w:pPr>
-        <w:pStyle w:val="Tabladeilustraciones"/>
-        <w:tabs>
-          <w:tab w:val="right" w:leader="dot" w:pos="8828"/>
-        </w:tabs>
-      </w:pPr>
-      <w:r>
-        <w:fldChar w:fldCharType="begin"/>
-      </w:r>
-      <w:r>
-        <w:rPr>
-          <w:rStyle w:val="Enlacedelndice"/>
-          <w:rFonts w:ascii="Times New Roman" w:hAnsi="Times New Roman"/>
-        </w:rPr>
-        <w:instrText xml:space="preserve"> TOC \c "Tabla" \h </w:instrText>
-      </w:r>
-      <w:r>
-        <w:rPr>
-          <w:rStyle w:val="Enlacedelndice"/>
-          <w:rFonts w:ascii="Times New Roman" w:hAnsi="Times New Roman"/>
-        </w:rPr>
-        <w:fldChar w:fldCharType="separate"/>
-      </w:r>
-      <w:hyperlink w:anchor="_Toc241140091">
-        <w:r>
-          <w:rPr>
-            <w:rStyle w:val="Enlacedelndice"/>
-            <w:rFonts w:ascii="Times New Roman" w:hAnsi="Times New Roman"/>
-          </w:rPr>
-          <w:t>Tabla 1 - Comparativa</w:t>
-        </w:r>
-        <w:r>
-          <w:rPr>
-            <w:webHidden/>
-          </w:rPr>
-          <w:fldChar w:fldCharType="begin"/>
-        </w:r>
-        <w:r>
-          <w:rPr>
-            <w:webHidden/>
-          </w:rPr>
-          <w:instrText>PAGEREF _Toc241140091 \h</w:instrText>
-        </w:r>
-        <w:r>
-          <w:rPr>
-            <w:webHidden/>
-          </w:rPr>
-        </w:r>
-        <w:r>
-          <w:rPr>
-            <w:webHidden/>
-          </w:rPr>
-          <w:fldChar w:fldCharType="separate"/>
-        </w:r>
-        <w:r>
-          <w:rPr>
-            <w:rStyle w:val="Enlacedelndice"/>
-            <w:rFonts w:ascii="Times New Roman" w:hAnsi="Times New Roman"/>
-          </w:rPr>
-          <w:t>8</w:t>
-        </w:r>
-        <w:r>
-          <w:rPr>
-            <w:webHidden/>
-          </w:rPr>
-          <w:fldChar w:fldCharType="end"/>
-        </w:r>
-      </w:hyperlink>
-      <w:r>
-        <w:rPr>
-          <w:rStyle w:val="Enlacedelndice"/>
-          <w:rFonts w:ascii="Times New Roman" w:hAnsi="Times New Roman"/>
-        </w:rPr>
-        <w:fldChar w:fldCharType="end"/>
-      </w:r>
-    </w:p>
-    <w:p>
-      <w:pPr>
-        <w:rPr>
-          <w:lang w:val="en-US"/>
-        </w:rPr>
-      </w:pPr>
-    </w:p>
-    <w:p>
-      <w:pPr>
         <w:rPr>
           <w:lang w:val="en-US"/>
         </w:rPr>
@@ -1363,113 +1249,12 @@
         <w:pStyle w:val="Ttulo1"/>
         <w:spacing w:before="0"/>
       </w:pPr>
-      <w:bookmarkStart w:id="1" w:name="_Toc241862473"/>
-      <w:r>
-        <w:lastRenderedPageBreak/>
-        <w:t>Listado de ilustraciones</w:t>
-      </w:r>
-      <w:bookmarkEnd w:id="1"/>
-    </w:p>
-    <w:p/>
-    <w:p>
-      <w:pPr>
-        <w:pStyle w:val="Tabladeilustraciones"/>
-        <w:tabs>
-          <w:tab w:val="right" w:leader="dot" w:pos="8828"/>
-        </w:tabs>
-      </w:pPr>
-      <w:r>
-        <w:fldChar w:fldCharType="begin"/>
-      </w:r>
-      <w:r>
-        <w:rPr>
-          <w:rStyle w:val="Enlacedelndice"/>
-          <w:rFonts w:ascii="Times New Roman" w:hAnsi="Times New Roman"/>
-        </w:rPr>
-        <w:instrText xml:space="preserve"> TOC \c "Ilustración" \h </w:instrText>
-      </w:r>
-      <w:r>
-        <w:rPr>
-          <w:rStyle w:val="Enlacedelndice"/>
-          <w:rFonts w:ascii="Times New Roman" w:hAnsi="Times New Roman"/>
-        </w:rPr>
-        <w:fldChar w:fldCharType="separate"/>
-      </w:r>
-      <w:hyperlink w:anchor="_Toc241140366">
-        <w:r>
-          <w:rPr>
-            <w:webHidden/>
-          </w:rPr>
-          <w:fldChar w:fldCharType="begin"/>
-        </w:r>
-        <w:r>
-          <w:rPr>
-            <w:webHidden/>
-          </w:rPr>
-          <w:instrText>PAGEREF _Toc24</w:instrText>
-        </w:r>
-        <w:r>
-          <w:rPr>
-            <w:webHidden/>
-          </w:rPr>
-          <w:instrText>1140366 \h</w:instrText>
-        </w:r>
-        <w:r>
-          <w:rPr>
-            <w:webHidden/>
-          </w:rPr>
-        </w:r>
-        <w:r>
-          <w:rPr>
-            <w:webHidden/>
-          </w:rPr>
-          <w:fldChar w:fldCharType="separate"/>
-        </w:r>
-        <w:r>
-          <w:rPr>
-            <w:rStyle w:val="Enlacedelndice"/>
-            <w:rFonts w:ascii="Times New Roman" w:hAnsi="Times New Roman"/>
-          </w:rPr>
-          <w:t>Ilustración 1 - Stack tecnologico</w:t>
-        </w:r>
-        <w:r>
-          <w:rPr>
-            <w:webHidden/>
-          </w:rPr>
-          <w:fldChar w:fldCharType="end"/>
-        </w:r>
-      </w:hyperlink>
-      <w:r>
-        <w:rPr>
-          <w:rStyle w:val="Enlacedelndice"/>
-          <w:rFonts w:ascii="Times New Roman" w:hAnsi="Times New Roman"/>
-        </w:rPr>
-        <w:fldChar w:fldCharType="end"/>
-      </w:r>
-    </w:p>
-    <w:p>
-      <w:pPr>
-        <w:rPr>
-          <w:rFonts w:ascii="Times New Roman" w:hAnsi="Times New Roman" w:cs="Times New Roman"/>
-          <w:color w:val="000000" w:themeColor="text1"/>
-          <w:lang w:val="en-US"/>
-        </w:rPr>
-      </w:pPr>
-      <w:r>
-        <w:br w:type="page"/>
-      </w:r>
-    </w:p>
-    <w:p>
-      <w:pPr>
-        <w:pStyle w:val="Ttulo1"/>
-        <w:spacing w:before="0"/>
-      </w:pPr>
-      <w:bookmarkStart w:id="2" w:name="_Toc241862474"/>
+      <w:bookmarkStart w:id="0" w:name="_Toc241862474"/>
       <w:r>
         <w:lastRenderedPageBreak/>
         <w:t>Introducción</w:t>
       </w:r>
-      <w:bookmarkEnd w:id="2"/>
+      <w:bookmarkEnd w:id="0"/>
     </w:p>
     <w:p/>
     <w:p/>
@@ -1479,13 +1264,7 @@
         <w:pStyle w:val="Apa7ma"/>
       </w:pPr>
       <w:r>
-        <w:t xml:space="preserve">El presente documento detalla los requisitos y especificaciones funcionales para el Recetario y Contenido del </w:t>
-      </w:r>
-      <w:r>
-        <w:t>proyecto Sazón, una plataforma digital orientada a la gestión y normalización de un catálogo gastronómico centrado en productos del Grupo Nutresa. Este módulo representa el corazón del producto, ya que proporciona las herramientas tecnológicas necesarias p</w:t>
-      </w:r>
-      <w:r>
-        <w:t xml:space="preserve">ara que los usuarios puedan crear, publicar y consultar diversas recetas de manera estructurada. La arquitectura del sistema se divide en un </w:t>
+        <w:t xml:space="preserve">El presente documento detalla los requisitos y especificaciones funcionales para el Recetario y Contenido del proyecto Sazón, una plataforma digital orientada a la gestión y normalización de un catálogo gastronómico centrado en productos del Grupo Nutresa. Este módulo representa el corazón del producto, ya que proporciona las herramientas tecnológicas necesarias para que los usuarios puedan crear, publicar y consultar diversas recetas de manera estructurada. La arquitectura del sistema se divide en un </w:t>
       </w:r>
       <w:proofErr w:type="spellStart"/>
       <w:r>
@@ -1517,10 +1296,7 @@
       </w:r>
       <w:proofErr w:type="spellEnd"/>
       <w:r>
-        <w:t>. Esta infraestructura té</w:t>
-      </w:r>
-      <w:r>
-        <w:t>cnica garantizará una experiencia de usuario fluida a través de diversas funcionalidades, desde un editor intuitivo hasta un modo de cocina paso a paso.</w:t>
+        <w:t>. Esta infraestructura técnica garantizará una experiencia de usuario fluida a través de diversas funcionalidades, desde un editor intuitivo hasta un modo de cocina paso a paso.</w:t>
       </w:r>
     </w:p>
     <w:p>
@@ -1538,12 +1314,12 @@
         <w:pStyle w:val="Ttulo1"/>
         <w:spacing w:before="0"/>
       </w:pPr>
-      <w:bookmarkStart w:id="3" w:name="_Toc241862475"/>
+      <w:bookmarkStart w:id="1" w:name="_Toc241862475"/>
       <w:r>
         <w:lastRenderedPageBreak/>
         <w:t>Planteamiento del problema</w:t>
       </w:r>
-      <w:bookmarkEnd w:id="3"/>
+      <w:bookmarkEnd w:id="1"/>
     </w:p>
     <w:p/>
     <w:p/>
@@ -1557,13 +1333,7 @@
         <w:pStyle w:val="Apa7ma"/>
       </w:pPr>
       <w:r>
-        <w:t>La digitalización de un catálogo de recetas requiere manejar informaci</w:t>
-      </w:r>
-      <w:r>
-        <w:t>ón relacional altamente estructurada que va más allá de un simple bloque de texto. El desafío principal radica en modelar y administrar correctamente las múltiples entidades que componen una receta para asegurar la integridad de los datos y facilitar la ex</w:t>
-      </w:r>
-      <w:r>
-        <w:t xml:space="preserve">periencia de búsqueda del usuario final. Específicamente, el sistema informático debe resolver los siguientes retos: </w:t>
+        <w:t xml:space="preserve">La digitalización de un catálogo de recetas requiere manejar información relacional altamente estructurada que va más allá de un simple bloque de texto. El desafío principal radica en modelar y administrar correctamente las múltiples entidades que componen una receta para asegurar la integridad de los datos y facilitar la experiencia de búsqueda del usuario final. Específicamente, el sistema informático debe resolver los siguientes retos: </w:t>
       </w:r>
     </w:p>
     <w:p>
@@ -1601,10 +1371,7 @@
         <w:t>Gestión dinámica de ingredientes y proporciones:</w:t>
       </w:r>
       <w:r>
-        <w:t xml:space="preserve"> Es </w:t>
-      </w:r>
-      <w:r>
-        <w:t xml:space="preserve">imperativo establecer una relación bidireccional donde a cada receta se le puedan asociar ingredientes específicos (ej. productos Doria o Zenú) junto con sus cantidades exactas y unidades de medida correspondientes (como gramos, mililitros o unidades). </w:t>
+        <w:t xml:space="preserve"> Es imperativo establecer una relación bidireccional donde a cada receta se le puedan asociar ingredientes específicos (ej. productos Doria o Zenú) junto con sus cantidades exactas y unidades de medida correspondientes (como gramos, mililitros o unidades). </w:t>
       </w:r>
     </w:p>
     <w:p>
@@ -1622,36 +1389,22 @@
           <w:b/>
           <w:bCs/>
         </w:rPr>
-        <w:t>Cl</w:t>
+        <w:t>Clasificación multidimensional:</w:t>
       </w:r>
       <w:r>
         <w:rPr>
           <w:rFonts w:ascii="Times New Roman" w:hAnsi="Times New Roman"/>
-          <w:b/>
-          <w:bCs/>
-        </w:rPr>
-        <w:t>asificación multidimensional:</w:t>
+        </w:rPr>
+        <w:t xml:space="preserve"> Una misma receta debe tener la flexibilidad de ser categorizada bajo múltiples etiquetas simultáneamente (por ejemplo, catalogar un plato como "desayuno",</w:t>
+      </w:r>
+      <w:r>
+        <w:t xml:space="preserve"> </w:t>
       </w:r>
       <w:r>
         <w:rPr>
           <w:rFonts w:ascii="Times New Roman" w:hAnsi="Times New Roman"/>
         </w:rPr>
-        <w:t xml:space="preserve"> Una misma receta debe tener la flexibilidad de ser categorizada bajo múltiples etiquetas simultáneamente (por ejemplo, catalogar un plato como "desayuno",</w:t>
-      </w:r>
-      <w:r>
-        <w:t xml:space="preserve"> </w:t>
-      </w:r>
-      <w:r>
-        <w:rPr>
-          <w:rFonts w:ascii="Times New Roman" w:hAnsi="Times New Roman"/>
-        </w:rPr>
-        <w:t>"rápida" y "económica" a la vez), lo cual es vital para alimentar los f</w:t>
-      </w:r>
-      <w:r>
-        <w:rPr>
-          <w:rFonts w:ascii="Times New Roman" w:hAnsi="Times New Roman"/>
-        </w:rPr>
-        <w:t xml:space="preserve">iltros de la galería. </w:t>
+        <w:t xml:space="preserve">"rápida" y "económica" a la vez), lo cual es vital para alimentar los filtros de la galería. </w:t>
       </w:r>
     </w:p>
     <w:p>
@@ -1678,13 +1431,7 @@
         <w:rPr>
           <w:rFonts w:ascii="Times New Roman" w:hAnsi="Times New Roman"/>
         </w:rPr>
-        <w:t xml:space="preserve"> El sistema carece actualmente de un flujo que permita guardar trabajo en progreso. Se requiere un CRUD que administre estados de publicación (borrador vs. publicada) y que se sostenga sobre un model</w:t>
-      </w:r>
-      <w:r>
-        <w:rPr>
-          <w:rFonts w:ascii="Times New Roman" w:hAnsi="Times New Roman"/>
-        </w:rPr>
-        <w:t xml:space="preserve">o de base de datos relacional de 5 tablas fundamentales diseñadas para evitar la redundancia de datos. </w:t>
+        <w:t xml:space="preserve"> El sistema carece actualmente de un flujo que permita guardar trabajo en progreso. Se requiere un CRUD que administre estados de publicación (borrador vs. publicada) y que se sostenga sobre un modelo de base de datos relacional de 5 tablas fundamentales diseñadas para evitar la redundancia de datos. </w:t>
       </w:r>
     </w:p>
     <w:p>
@@ -1697,12 +1444,12 @@
         <w:pStyle w:val="Ttulo1"/>
         <w:spacing w:before="0"/>
       </w:pPr>
-      <w:bookmarkStart w:id="4" w:name="_Toc241862476"/>
+      <w:bookmarkStart w:id="2" w:name="_Toc241862476"/>
       <w:r>
         <w:lastRenderedPageBreak/>
         <w:t>Coordinación, revisión global y consolidación final</w:t>
       </w:r>
-      <w:bookmarkEnd w:id="4"/>
+      <w:bookmarkEnd w:id="2"/>
     </w:p>
     <w:p>
       <w:pPr>
@@ -1730,10 +1477,7 @@
         <w:pStyle w:val="Apa7ma"/>
       </w:pPr>
       <w:r>
-        <w:t>Bajo el marco de las metodologías ágiles, la ejecución de la Célula 2 requiere una sincronizaci</w:t>
-      </w:r>
-      <w:r>
-        <w:t>ón continua entre los esfuerzos de desarrollo de Front y Back, asegurando entregas de valor iterativas.</w:t>
+        <w:t>Bajo el marco de las metodologías ágiles, la ejecución de la Célula 2 requiere una sincronización continua entre los esfuerzos de desarrollo de Front y Back, asegurando entregas de valor iterativas.</w:t>
       </w:r>
     </w:p>
     <w:p>
@@ -1756,10 +1500,7 @@
       </w:r>
       <w:proofErr w:type="spellEnd"/>
       <w:r>
-        <w:t xml:space="preserve"> (editor por pasos, vista de detall</w:t>
-      </w:r>
-      <w:r>
-        <w:t xml:space="preserve">e, galería con filtros de tiempo y dificultad) con los servicios </w:t>
+        <w:t xml:space="preserve"> (editor por pasos, vista de detalle, galería con filtros de tiempo y dificultad) con los servicios </w:t>
       </w:r>
       <w:proofErr w:type="spellStart"/>
       <w:r>
@@ -1783,10 +1524,7 @@
       </w:r>
       <w:proofErr w:type="spellEnd"/>
       <w:r>
-        <w:t xml:space="preserve"> que alimentarán la información de tiempos, porcion</w:t>
-      </w:r>
-      <w:r>
-        <w:t xml:space="preserve">es y dificultad visualizada por el usuario. </w:t>
+        <w:t xml:space="preserve"> que alimentarán la información de tiempos, porciones y dificultad visualizada por el usuario. </w:t>
       </w:r>
     </w:p>
     <w:p>
@@ -1801,10 +1539,7 @@
         <w:t>Revisión Global:</w:t>
       </w:r>
       <w:r>
-        <w:t xml:space="preserve"> Durante los ciclos de revisión, se validará que el modelo relacional deducido de 5 tablas soporte adecuadamente todas las reglas de negocio. Se verificará la correcta normalización de la tabla d</w:t>
-      </w:r>
-      <w:r>
-        <w:t xml:space="preserve">e Recetas, la tabla de Pasos (con su atributo de orden lógico), la tabla de Ingredientes, la tabla intermedia de </w:t>
+        <w:t xml:space="preserve"> Durante los ciclos de revisión, se validará que el modelo relacional deducido de 5 tablas soporte adecuadamente todas las reglas de negocio. Se verificará la correcta normalización de la tabla de Recetas, la tabla de Pasos (con su atributo de orden lógico), la tabla de Ingredientes, la tabla intermedia de </w:t>
       </w:r>
       <w:proofErr w:type="spellStart"/>
       <w:r>
@@ -1827,10 +1562,7 @@
         <w:t>Consolidación</w:t>
       </w:r>
       <w:r>
-        <w:t xml:space="preserve"> Final: Esta fase consistirá en la </w:t>
-      </w:r>
-      <w:r>
-        <w:t>integración continua y el aseguramiento de calidad del incremento del producto. Se realizarán pruebas de extremo a extremo (</w:t>
+        <w:t xml:space="preserve"> Final: Esta fase consistirá en la integración continua y el aseguramiento de calidad del incremento del producto. Se realizarán pruebas de extremo a extremo (</w:t>
       </w:r>
       <w:proofErr w:type="spellStart"/>
       <w:r>
@@ -1838,17 +1570,11 @@
       </w:r>
       <w:proofErr w:type="spellEnd"/>
       <w:r>
-        <w:t>) para certificar que el flujo de valor se cumple en su totalidad: desde la creación de una receta en estado de "borrador"</w:t>
-      </w:r>
-      <w:r>
-        <w:t xml:space="preserve">, la asignación correcta de ingredientes y pasos secuenciales, hasta su transición a "publicada". Finalmente, se consolidará la entrega </w:t>
+        <w:t xml:space="preserve">) para certificar que el flujo de valor se cumple en su totalidad: desde la creación de una receta en estado de "borrador", la asignación correcta de ingredientes y pasos secuenciales, hasta su transición a "publicada". Finalmente, se consolidará la entrega </w:t>
       </w:r>
       <w:r>
         <w:lastRenderedPageBreak/>
-        <w:t>asegurando que características clave, como el "modo cocina paso a paso" y la galería interactiva, cumplan con los criter</w:t>
-      </w:r>
-      <w:r>
-        <w:t xml:space="preserve">ios de aceptación técnicos y de experiencia de usuario. </w:t>
+        <w:t xml:space="preserve">asegurando que características clave, como el "modo cocina paso a paso" y la galería interactiva, cumplan con los criterios de aceptación técnicos y de experiencia de usuario. </w:t>
       </w:r>
     </w:p>
     <w:p>
@@ -1870,12 +1596,12 @@
         <w:pStyle w:val="Ttulo1"/>
         <w:spacing w:before="0"/>
       </w:pPr>
-      <w:bookmarkStart w:id="5" w:name="_Toc241862477"/>
+      <w:bookmarkStart w:id="3" w:name="_Toc241862477"/>
       <w:r>
         <w:lastRenderedPageBreak/>
         <w:t>Objetivos</w:t>
       </w:r>
-      <w:bookmarkEnd w:id="5"/>
+      <w:bookmarkEnd w:id="3"/>
     </w:p>
     <w:p>
       <w:pPr>
@@ -1902,11 +1628,11 @@
       <w:pPr>
         <w:pStyle w:val="Ttulo2"/>
       </w:pPr>
-      <w:bookmarkStart w:id="6" w:name="_Toc241862478"/>
+      <w:bookmarkStart w:id="4" w:name="_Toc241862478"/>
       <w:r>
         <w:t>Objetivo General</w:t>
       </w:r>
-      <w:bookmarkEnd w:id="6"/>
+      <w:bookmarkEnd w:id="4"/>
     </w:p>
     <w:p>
       <w:pPr>
@@ -1920,24 +1646,18 @@
         <w:rPr>
           <w:rFonts w:ascii="Times New Roman" w:hAnsi="Times New Roman"/>
         </w:rPr>
-        <w:t xml:space="preserve">el propósito es desarrollar una plataforma web para la gestión y digitalización del catálogo de recetas y contenidos de Sazón, permitiendo a los usuarios </w:t>
-      </w:r>
-      <w:r>
-        <w:rPr>
-          <w:rFonts w:ascii="Times New Roman" w:hAnsi="Times New Roman"/>
-        </w:rPr>
-        <w:t>explorar y encontrar preparaciones basadas en productos de Nutresa disponibles en el hogar.</w:t>
+        <w:t>el propósito es desarrollar una plataforma web para la gestión y digitalización del catálogo de recetas y contenidos de Sazón, permitiendo a los usuarios explorar y encontrar preparaciones basadas en productos de Nutresa disponibles en el hogar.</w:t>
       </w:r>
     </w:p>
     <w:p>
       <w:pPr>
         <w:pStyle w:val="Ttulo2"/>
       </w:pPr>
-      <w:bookmarkStart w:id="7" w:name="_Toc241862479"/>
+      <w:bookmarkStart w:id="5" w:name="_Toc241862479"/>
       <w:r>
         <w:t>Objetivos específicos</w:t>
       </w:r>
-      <w:bookmarkEnd w:id="7"/>
+      <w:bookmarkEnd w:id="5"/>
     </w:p>
     <w:p>
       <w:pPr>
@@ -1968,10 +1688,7 @@
         <w:ind w:firstLine="0"/>
       </w:pPr>
       <w:r>
-        <w:t>Diseñar el diagrama entidad-relación para clasificar formalmente las recetas, ingredientes</w:t>
-      </w:r>
-      <w:r>
-        <w:t>, unidades de medida, categorías culinarias y tiempos de preparación.</w:t>
+        <w:t>Diseñar el diagrama entidad-relación para clasificar formalmente las recetas, ingredientes, unidades de medida, categorías culinarias y tiempos de preparación.</w:t>
       </w:r>
     </w:p>
     <w:p>
@@ -2031,10 +1748,7 @@
         <w:ind w:firstLine="437"/>
       </w:pPr>
       <w:r>
-        <w:t>Estructurar el motor de recetas priorizando el aprovechamiento de los insumos y pr</w:t>
-      </w:r>
-      <w:r>
-        <w:t>oductos de la marca que el usuario final habitualmente consume o posee en su hogar.</w:t>
+        <w:t>Estructurar el motor de recetas priorizando el aprovechamiento de los insumos y productos de la marca que el usuario final habitualmente consume o posee en su hogar.</w:t>
       </w:r>
     </w:p>
     <w:p>
@@ -2065,10 +1779,7 @@
       </w:pPr>
       <w:r>
         <w:lastRenderedPageBreak/>
-        <w:t>Desarrollar algoritmos de búsqueda eficientes que permitan filtrar recetas por ingredientes específicos, niv</w:t>
-      </w:r>
-      <w:r>
-        <w:t>el de dificultad, tiempo de elaboración o categoría.</w:t>
+        <w:t>Desarrollar algoritmos de búsqueda eficientes que permitan filtrar recetas por ingredientes específicos, nivel de dificultad, tiempo de elaboración o categoría.</w:t>
       </w:r>
     </w:p>
     <w:p>
@@ -2098,14 +1809,7 @@
           <w:b/>
           <w:bCs/>
         </w:rPr>
-        <w:t>C</w:t>
-      </w:r>
-      <w:r>
-        <w:rPr>
-          <w:b/>
-          <w:bCs/>
-        </w:rPr>
-        <w:t>onstruir una interfaz de usuario (UI/UX) accesible y adaptativa</w:t>
+        <w:t>Construir una interfaz de usuario (UI/UX) accesible y adaptativa</w:t>
       </w:r>
       <w:r>
         <w:t>:</w:t>
@@ -2150,10 +1854,7 @@
         <w:ind w:firstLine="437"/>
       </w:pPr>
       <w:r>
-        <w:t>Garantizar una navegación intuitiva que facilite la consu</w:t>
-      </w:r>
-      <w:r>
-        <w:t>lta de los pasos de preparación y la visualización clara de la lista de ingredientes.</w:t>
+        <w:t>Garantizar una navegación intuitiva que facilite la consulta de los pasos de preparación y la visualización clara de la lista de ingredientes.</w:t>
       </w:r>
     </w:p>
     <w:p>
@@ -2187,10 +1888,7 @@
         <w:ind w:firstLine="437"/>
       </w:pPr>
       <w:r>
-        <w:t>Ejecutar pruebas unitarias y de integración para comprobar la consistencia de los datos almacenados y el</w:t>
-      </w:r>
-      <w:r>
-        <w:t xml:space="preserve"> correcto funcionamiento de los filtros.</w:t>
+        <w:t>Ejecutar pruebas unitarias y de integración para comprobar la consistencia de los datos almacenados y el correcto funcionamiento de los filtros.</w:t>
       </w:r>
     </w:p>
     <w:p>
@@ -2224,7 +1922,7 @@
         <w:pStyle w:val="Ttulo1"/>
         <w:spacing w:before="0"/>
       </w:pPr>
-      <w:bookmarkStart w:id="8" w:name="_Toc241862480"/>
+      <w:bookmarkStart w:id="6" w:name="_Toc241862480"/>
       <w:proofErr w:type="spellStart"/>
       <w:r>
         <w:lastRenderedPageBreak/>
@@ -2234,7 +1932,7 @@
       <w:r>
         <w:t xml:space="preserve"> tecnológico</w:t>
       </w:r>
-      <w:bookmarkEnd w:id="8"/>
+      <w:bookmarkEnd w:id="6"/>
     </w:p>
     <w:p>
       <w:pPr>
@@ -2252,240 +1950,29 @@
     </w:p>
     <w:p>
       <w:pPr>
+        <w:spacing w:after="0" w:line="240" w:lineRule="auto"/>
         <w:rPr>
           <w:rFonts w:ascii="Times New Roman" w:hAnsi="Times New Roman"/>
         </w:rPr>
       </w:pPr>
-    </w:p>
-    <w:p>
-      <w:pPr>
-        <w:spacing w:line="480" w:lineRule="auto"/>
-        <w:ind w:firstLine="720"/>
+      <w:r>
         <w:rPr>
           <w:rFonts w:ascii="Times New Roman" w:hAnsi="Times New Roman"/>
         </w:rPr>
-      </w:pPr>
-      <w:r>
-        <w:rPr>
-          <w:rFonts w:ascii="Times New Roman" w:hAnsi="Times New Roman"/>
-        </w:rPr>
-        <w:t>El desarrollo de la plataforma se estructurará div</w:t>
-      </w:r>
-      <w:r>
-        <w:rPr>
-          <w:rFonts w:ascii="Times New Roman" w:hAnsi="Times New Roman"/>
-        </w:rPr>
-        <w:t xml:space="preserve">idiendo la interfaz visual y la lógica interna mediante un </w:t>
-      </w:r>
-      <w:proofErr w:type="spellStart"/>
-      <w:r>
-        <w:rPr>
-          <w:rFonts w:ascii="Times New Roman" w:hAnsi="Times New Roman"/>
-        </w:rPr>
-        <w:t>stack</w:t>
-      </w:r>
-      <w:proofErr w:type="spellEnd"/>
-      <w:r>
-        <w:rPr>
-          <w:rFonts w:ascii="Times New Roman" w:hAnsi="Times New Roman"/>
-        </w:rPr>
-        <w:t xml:space="preserve"> tecnológico claro. En el lado del cliente, se utilizará HTML para construir la estructura de las pantallas, CSS para darle un diseño visual moderno y JavaScript para programar la interactivid</w:t>
-      </w:r>
-      <w:r>
-        <w:rPr>
-          <w:rFonts w:ascii="Times New Roman" w:hAnsi="Times New Roman"/>
-        </w:rPr>
-        <w:t xml:space="preserve">ad y dinamismo de la interfaz. Para agilizar la experiencia de navegación, se hará uso de </w:t>
-      </w:r>
-      <w:proofErr w:type="spellStart"/>
-      <w:r>
-        <w:rPr>
-          <w:rFonts w:ascii="Times New Roman" w:hAnsi="Times New Roman"/>
-        </w:rPr>
-        <w:t>localStorage</w:t>
-      </w:r>
-      <w:proofErr w:type="spellEnd"/>
-      <w:r>
-        <w:rPr>
-          <w:rFonts w:ascii="Times New Roman" w:hAnsi="Times New Roman"/>
-        </w:rPr>
-        <w:t>, lo que permite una persistencia de datos temporal directamente en el dispositivo del usuario, ideal para mantener sesiones activas o guardar preferencia</w:t>
-      </w:r>
-      <w:r>
-        <w:rPr>
-          <w:rFonts w:ascii="Times New Roman" w:hAnsi="Times New Roman"/>
-        </w:rPr>
-        <w:t>s rápidas sin saturar el servidor. Por otro lado, el núcleo del sistema (</w:t>
-      </w:r>
-      <w:proofErr w:type="spellStart"/>
-      <w:r>
-        <w:rPr>
-          <w:rFonts w:ascii="Times New Roman" w:hAnsi="Times New Roman"/>
-        </w:rPr>
-        <w:t>backend</w:t>
-      </w:r>
-      <w:proofErr w:type="spellEnd"/>
-      <w:r>
-        <w:rPr>
-          <w:rFonts w:ascii="Times New Roman" w:hAnsi="Times New Roman"/>
-        </w:rPr>
-        <w:t>) estará desarrollado en Java, encargado de procesar las reglas de negocio, gestionar la seguridad y coordinar las peticiones. Finalmente, para garantizar una persistencia de d</w:t>
-      </w:r>
-      <w:r>
-        <w:rPr>
-          <w:rFonts w:ascii="Times New Roman" w:hAnsi="Times New Roman"/>
-        </w:rPr>
-        <w:t>atos permanente, estructurada y segura a largo plazo —como la información de los clientes, las citas programadas y el historial de servicios—, todo el sistema estará respaldado por una base de datos relacional gestionada mediante SQL.</w:t>
-      </w:r>
-    </w:p>
-    <w:p>
-      <w:pPr>
-        <w:spacing w:line="480" w:lineRule="auto"/>
-        <w:ind w:firstLine="720"/>
-        <w:rPr>
-          <w:rFonts w:ascii="Times New Roman" w:hAnsi="Times New Roman"/>
-        </w:rPr>
-      </w:pPr>
-    </w:p>
-    <w:p>
-      <w:pPr>
-        <w:keepNext/>
-        <w:spacing w:line="480" w:lineRule="auto"/>
-        <w:ind w:firstLine="720"/>
-        <w:rPr>
-          <w:rFonts w:ascii="Times New Roman" w:hAnsi="Times New Roman"/>
-        </w:rPr>
-      </w:pPr>
-      <w:r>
-        <w:rPr>
-          <w:noProof/>
-        </w:rPr>
-        <w:lastRenderedPageBreak/>
-        <w:drawing>
-          <wp:inline distT="0" distB="0" distL="0" distR="0" wp14:anchorId="26AFE09B" wp14:editId="44485906">
-            <wp:extent cx="1972945" cy="7827645"/>
-            <wp:effectExtent l="0" t="0" r="0" b="0"/>
-            <wp:docPr id="1" name="Picture 2"/>
-            <wp:cNvGraphicFramePr>
-              <a:graphicFrameLocks xmlns:a="http://schemas.openxmlformats.org/drawingml/2006/main" noChangeAspect="1"/>
-            </wp:cNvGraphicFramePr>
-            <a:graphic xmlns:a="http://schemas.openxmlformats.org/drawingml/2006/main">
-              <a:graphicData uri="http://schemas.openxmlformats.org/drawingml/2006/picture">
-                <pic:pic xmlns:pic="http://schemas.openxmlformats.org/drawingml/2006/picture">
-                  <pic:nvPicPr>
-                    <pic:cNvPr id="1" name="Picture 2"/>
-                    <pic:cNvPicPr>
-                      <a:picLocks noChangeAspect="1" noChangeArrowheads="1"/>
-                    </pic:cNvPicPr>
-                  </pic:nvPicPr>
-                  <pic:blipFill>
-                    <a:blip r:embed="rId6"/>
-                    <a:stretch>
-                      <a:fillRect/>
-                    </a:stretch>
-                  </pic:blipFill>
-                  <pic:spPr bwMode="auto">
-                    <a:xfrm>
-                      <a:off x="0" y="0"/>
-                      <a:ext cx="1972945" cy="7827645"/>
-                    </a:xfrm>
-                    <a:prstGeom prst="rect">
-                      <a:avLst/>
-                    </a:prstGeom>
-                  </pic:spPr>
-                </pic:pic>
-              </a:graphicData>
-            </a:graphic>
-          </wp:inline>
-        </w:drawing>
-      </w:r>
-    </w:p>
-    <w:p>
-      <w:pPr>
-        <w:pStyle w:val="Descripcin"/>
-        <w:rPr>
-          <w:rFonts w:ascii="Times New Roman" w:hAnsi="Times New Roman"/>
-        </w:rPr>
-      </w:pPr>
-      <w:bookmarkStart w:id="9" w:name="_Toc241140366"/>
-      <w:r>
-        <w:rPr>
-          <w:rFonts w:ascii="Times New Roman" w:hAnsi="Times New Roman"/>
-        </w:rPr>
-        <w:t xml:space="preserve">Ilustración </w:t>
-      </w:r>
-      <w:r>
-        <w:rPr>
-          <w:rFonts w:ascii="Times New Roman" w:hAnsi="Times New Roman"/>
-        </w:rPr>
-        <w:fldChar w:fldCharType="begin"/>
-      </w:r>
-      <w:r>
-        <w:rPr>
-          <w:rFonts w:ascii="Times New Roman" w:hAnsi="Times New Roman"/>
-        </w:rPr>
-        <w:instrText xml:space="preserve"> SEQ I</w:instrText>
-      </w:r>
-      <w:r>
-        <w:rPr>
-          <w:rFonts w:ascii="Times New Roman" w:hAnsi="Times New Roman"/>
-        </w:rPr>
-        <w:instrText xml:space="preserve">lustración \* ARABIC </w:instrText>
-      </w:r>
-      <w:r>
-        <w:rPr>
-          <w:rFonts w:ascii="Times New Roman" w:hAnsi="Times New Roman"/>
-        </w:rPr>
-        <w:fldChar w:fldCharType="separate"/>
-      </w:r>
-      <w:r>
-        <w:rPr>
-          <w:rFonts w:ascii="Times New Roman" w:hAnsi="Times New Roman"/>
-        </w:rPr>
-        <w:t>1</w:t>
-      </w:r>
-      <w:r>
-        <w:rPr>
-          <w:rFonts w:ascii="Times New Roman" w:hAnsi="Times New Roman"/>
-        </w:rPr>
-        <w:fldChar w:fldCharType="end"/>
-      </w:r>
-      <w:r>
-        <w:rPr>
-          <w:rFonts w:ascii="Times New Roman" w:hAnsi="Times New Roman"/>
-        </w:rPr>
-        <w:t xml:space="preserve"> - </w:t>
-      </w:r>
-      <w:proofErr w:type="spellStart"/>
-      <w:r>
-        <w:rPr>
-          <w:rFonts w:ascii="Times New Roman" w:hAnsi="Times New Roman"/>
-        </w:rPr>
-        <w:t>Stack</w:t>
-      </w:r>
-      <w:proofErr w:type="spellEnd"/>
-      <w:r>
-        <w:rPr>
-          <w:rFonts w:ascii="Times New Roman" w:hAnsi="Times New Roman"/>
-        </w:rPr>
-        <w:t xml:space="preserve"> tecnológico</w:t>
-      </w:r>
-      <w:bookmarkEnd w:id="9"/>
-      <w:r>
         <w:br w:type="page"/>
       </w:r>
     </w:p>
+    <w:p/>
     <w:p>
       <w:pPr>
         <w:pStyle w:val="Ttulo1"/>
         <w:spacing w:before="0"/>
       </w:pPr>
-      <w:bookmarkStart w:id="10" w:name="_Toc241862481"/>
-      <w:r>
-        <w:lastRenderedPageBreak/>
+      <w:bookmarkStart w:id="7" w:name="_Toc241862481"/>
+      <w:r>
         <w:t>Alcance</w:t>
       </w:r>
-      <w:bookmarkEnd w:id="10"/>
+      <w:bookmarkEnd w:id="7"/>
     </w:p>
     <w:p>
       <w:pPr>
@@ -2507,399 +1994,6 @@
           <w:rFonts w:ascii="Times New Roman" w:hAnsi="Times New Roman"/>
         </w:rPr>
       </w:pPr>
-    </w:p>
-    <w:p>
-      <w:pPr>
-        <w:spacing w:line="480" w:lineRule="auto"/>
-        <w:ind w:firstLine="720"/>
-        <w:rPr>
-          <w:rFonts w:ascii="Times New Roman" w:hAnsi="Times New Roman"/>
-        </w:rPr>
-      </w:pPr>
-      <w:r>
-        <w:rPr>
-          <w:rFonts w:ascii="Times New Roman" w:hAnsi="Times New Roman"/>
-        </w:rPr>
-        <w:t>El desarrollo de la aplicación se enfocará exclusivamente en solucionar la gestión de citas, la organización del tiempo de los barberos y el registro de clientes. A nivel funcional, el sistema abarc</w:t>
-      </w:r>
-      <w:r>
-        <w:rPr>
-          <w:rFonts w:ascii="Times New Roman" w:hAnsi="Times New Roman"/>
-        </w:rPr>
-        <w:t>a los siguientes módulos:</w:t>
-      </w:r>
-    </w:p>
-    <w:p>
-      <w:pPr>
-        <w:rPr>
-          <w:rFonts w:ascii="Times New Roman" w:hAnsi="Times New Roman"/>
-        </w:rPr>
-      </w:pPr>
-    </w:p>
-    <w:p>
-      <w:pPr>
-        <w:pStyle w:val="Ttulo2"/>
-      </w:pPr>
-      <w:bookmarkStart w:id="11" w:name="_Toc241862482"/>
-      <w:r>
-        <w:t>Inclusiones</w:t>
-      </w:r>
-      <w:bookmarkEnd w:id="11"/>
-    </w:p>
-    <w:p>
-      <w:pPr>
-        <w:spacing w:line="480" w:lineRule="auto"/>
-        <w:rPr>
-          <w:rFonts w:ascii="Times New Roman" w:hAnsi="Times New Roman"/>
-        </w:rPr>
-      </w:pPr>
-      <w:r>
-        <w:rPr>
-          <w:rFonts w:ascii="Times New Roman" w:hAnsi="Times New Roman"/>
-          <w:b/>
-          <w:bCs/>
-        </w:rPr>
-        <w:t>1. Módulo de Clientes:</w:t>
-      </w:r>
-    </w:p>
-    <w:p>
-      <w:pPr>
-        <w:numPr>
-          <w:ilvl w:val="0"/>
-          <w:numId w:val="2"/>
-        </w:numPr>
-        <w:spacing w:line="480" w:lineRule="auto"/>
-        <w:rPr>
-          <w:rFonts w:ascii="Times New Roman" w:hAnsi="Times New Roman"/>
-        </w:rPr>
-      </w:pPr>
-      <w:r>
-        <w:rPr>
-          <w:rFonts w:ascii="Times New Roman" w:hAnsi="Times New Roman"/>
-          <w:b/>
-          <w:bCs/>
-        </w:rPr>
-        <w:t>Gestión de perfil:</w:t>
-      </w:r>
-      <w:r>
-        <w:rPr>
-          <w:rFonts w:ascii="Times New Roman" w:hAnsi="Times New Roman"/>
-        </w:rPr>
-        <w:t xml:space="preserve"> Registro de nuevos usuarios, inicio de sesión (apoyado en persistencia temporal para evitar ingresos constantes) y actualización de datos de contacto.</w:t>
-      </w:r>
-    </w:p>
-    <w:p>
-      <w:pPr>
-        <w:numPr>
-          <w:ilvl w:val="0"/>
-          <w:numId w:val="2"/>
-        </w:numPr>
-        <w:spacing w:line="480" w:lineRule="auto"/>
-        <w:rPr>
-          <w:rFonts w:ascii="Times New Roman" w:hAnsi="Times New Roman"/>
-        </w:rPr>
-      </w:pPr>
-      <w:r>
-        <w:rPr>
-          <w:rFonts w:ascii="Times New Roman" w:hAnsi="Times New Roman"/>
-          <w:b/>
-          <w:bCs/>
-        </w:rPr>
-        <w:t>Agendamiento autónomo:</w:t>
-      </w:r>
-      <w:r>
-        <w:rPr>
-          <w:rFonts w:ascii="Times New Roman" w:hAnsi="Times New Roman"/>
-        </w:rPr>
-        <w:t xml:space="preserve"> Interfaz donde el cliente puede consultar el catálogo de servicios (con precios y</w:t>
-      </w:r>
-      <w:r>
-        <w:rPr>
-          <w:rFonts w:ascii="Times New Roman" w:hAnsi="Times New Roman"/>
-        </w:rPr>
-        <w:t xml:space="preserve"> duración), ver la disponibilidad de los barberos en tiempo real y reservar una fecha y hora específicas.</w:t>
-      </w:r>
-    </w:p>
-    <w:p>
-      <w:pPr>
-        <w:numPr>
-          <w:ilvl w:val="0"/>
-          <w:numId w:val="2"/>
-        </w:numPr>
-        <w:spacing w:line="480" w:lineRule="auto"/>
-        <w:rPr>
-          <w:rFonts w:ascii="Times New Roman" w:hAnsi="Times New Roman"/>
-        </w:rPr>
-      </w:pPr>
-      <w:r>
-        <w:rPr>
-          <w:rFonts w:ascii="Times New Roman" w:hAnsi="Times New Roman"/>
-          <w:b/>
-          <w:bCs/>
-        </w:rPr>
-        <w:t>Administración de reservas:</w:t>
-      </w:r>
-      <w:r>
-        <w:rPr>
-          <w:rFonts w:ascii="Times New Roman" w:hAnsi="Times New Roman"/>
-        </w:rPr>
-        <w:t xml:space="preserve"> Capacidad para que el cliente visualice sus citas próximas y pueda cancelarlas o modificarlas dentro de los tiempos permit</w:t>
-      </w:r>
-      <w:r>
-        <w:rPr>
-          <w:rFonts w:ascii="Times New Roman" w:hAnsi="Times New Roman"/>
-        </w:rPr>
-        <w:t>idos.</w:t>
-      </w:r>
-    </w:p>
-    <w:p>
-      <w:pPr>
-        <w:spacing w:line="480" w:lineRule="auto"/>
-        <w:rPr>
-          <w:rFonts w:ascii="Times New Roman" w:hAnsi="Times New Roman"/>
-        </w:rPr>
-      </w:pPr>
-      <w:r>
-        <w:rPr>
-          <w:rFonts w:ascii="Times New Roman" w:hAnsi="Times New Roman"/>
-          <w:b/>
-          <w:bCs/>
-        </w:rPr>
-        <w:t>2. Módulo de Barberos / Administración:</w:t>
-      </w:r>
-    </w:p>
-    <w:p>
-      <w:pPr>
-        <w:numPr>
-          <w:ilvl w:val="0"/>
-          <w:numId w:val="3"/>
-        </w:numPr>
-        <w:spacing w:line="480" w:lineRule="auto"/>
-        <w:rPr>
-          <w:rFonts w:ascii="Times New Roman" w:hAnsi="Times New Roman"/>
-        </w:rPr>
-      </w:pPr>
-      <w:r>
-        <w:rPr>
-          <w:rFonts w:ascii="Times New Roman" w:hAnsi="Times New Roman"/>
-          <w:b/>
-          <w:bCs/>
-        </w:rPr>
-        <w:t>Visualización de agenda:</w:t>
-      </w:r>
-      <w:r>
-        <w:rPr>
-          <w:rFonts w:ascii="Times New Roman" w:hAnsi="Times New Roman"/>
-        </w:rPr>
-        <w:t xml:space="preserve"> Panel de control centralizado donde cada barbero puede ver su cronograma diario de forma ordenada.</w:t>
-      </w:r>
-    </w:p>
-    <w:p>
-      <w:pPr>
-        <w:numPr>
-          <w:ilvl w:val="0"/>
-          <w:numId w:val="3"/>
-        </w:numPr>
-        <w:spacing w:line="480" w:lineRule="auto"/>
-        <w:rPr>
-          <w:rFonts w:ascii="Times New Roman" w:hAnsi="Times New Roman"/>
-        </w:rPr>
-      </w:pPr>
-      <w:r>
-        <w:rPr>
-          <w:rFonts w:ascii="Times New Roman" w:hAnsi="Times New Roman"/>
-          <w:b/>
-          <w:bCs/>
-        </w:rPr>
-        <w:t>Gestión de estados:</w:t>
-      </w:r>
-      <w:r>
-        <w:rPr>
-          <w:rFonts w:ascii="Times New Roman" w:hAnsi="Times New Roman"/>
-        </w:rPr>
-        <w:t xml:space="preserve"> Opción para cambiar el estado de la cita a medida que avanza el día (pendiente, completada, inasistencia o cancelada).</w:t>
-      </w:r>
-    </w:p>
-    <w:p>
-      <w:pPr>
-        <w:numPr>
-          <w:ilvl w:val="0"/>
-          <w:numId w:val="3"/>
-        </w:numPr>
-        <w:spacing w:line="480" w:lineRule="auto"/>
-        <w:rPr>
-          <w:rFonts w:ascii="Times New Roman" w:hAnsi="Times New Roman"/>
-        </w:rPr>
-      </w:pPr>
-      <w:r>
-        <w:rPr>
-          <w:rFonts w:ascii="Times New Roman" w:hAnsi="Times New Roman"/>
-          <w:b/>
-          <w:bCs/>
-        </w:rPr>
-        <w:lastRenderedPageBreak/>
-        <w:t>Historial de atención:</w:t>
-      </w:r>
-      <w:r>
-        <w:rPr>
-          <w:rFonts w:ascii="Times New Roman" w:hAnsi="Times New Roman"/>
-        </w:rPr>
-        <w:t xml:space="preserve"> Acceso al perfil del cliente para revisar qué cortes se ha realizado anteriormente y cuáles son sus preferencias,</w:t>
-      </w:r>
-      <w:r>
-        <w:rPr>
-          <w:rFonts w:ascii="Times New Roman" w:hAnsi="Times New Roman"/>
-        </w:rPr>
-        <w:t xml:space="preserve"> permitiendo un servicio personalizado.</w:t>
-      </w:r>
-    </w:p>
-    <w:p>
-      <w:pPr>
-        <w:spacing w:line="480" w:lineRule="auto"/>
-        <w:rPr>
-          <w:rFonts w:ascii="Times New Roman" w:hAnsi="Times New Roman"/>
-        </w:rPr>
-      </w:pPr>
-      <w:r>
-        <w:rPr>
-          <w:rFonts w:ascii="Times New Roman" w:hAnsi="Times New Roman"/>
-          <w:b/>
-          <w:bCs/>
-        </w:rPr>
-        <w:t>3. Funciones Internas del Sistema:</w:t>
-      </w:r>
-    </w:p>
-    <w:p>
-      <w:pPr>
-        <w:numPr>
-          <w:ilvl w:val="0"/>
-          <w:numId w:val="4"/>
-        </w:numPr>
-        <w:spacing w:line="480" w:lineRule="auto"/>
-        <w:rPr>
-          <w:rFonts w:ascii="Times New Roman" w:hAnsi="Times New Roman"/>
-        </w:rPr>
-      </w:pPr>
-      <w:r>
-        <w:rPr>
-          <w:rFonts w:ascii="Times New Roman" w:hAnsi="Times New Roman"/>
-          <w:b/>
-          <w:bCs/>
-        </w:rPr>
-        <w:t>Prevención de solapamiento:</w:t>
-      </w:r>
-      <w:r>
-        <w:rPr>
-          <w:rFonts w:ascii="Times New Roman" w:hAnsi="Times New Roman"/>
-        </w:rPr>
-        <w:t xml:space="preserve"> Lógica en el </w:t>
-      </w:r>
-      <w:proofErr w:type="spellStart"/>
-      <w:r>
-        <w:rPr>
-          <w:rFonts w:ascii="Times New Roman" w:hAnsi="Times New Roman"/>
-        </w:rPr>
-        <w:t>backend</w:t>
-      </w:r>
-      <w:proofErr w:type="spellEnd"/>
-      <w:r>
-        <w:rPr>
-          <w:rFonts w:ascii="Times New Roman" w:hAnsi="Times New Roman"/>
-        </w:rPr>
-        <w:t xml:space="preserve"> que valida y bloquea los horarios ocupados, garantizando que no existan cruces de citas para un mismo barbero.</w:t>
-      </w:r>
-    </w:p>
-    <w:p>
-      <w:pPr>
-        <w:numPr>
-          <w:ilvl w:val="0"/>
-          <w:numId w:val="4"/>
-        </w:numPr>
-        <w:spacing w:line="480" w:lineRule="auto"/>
-        <w:rPr>
-          <w:rFonts w:ascii="Times New Roman" w:hAnsi="Times New Roman"/>
-        </w:rPr>
-      </w:pPr>
-      <w:r>
-        <w:rPr>
-          <w:rFonts w:ascii="Times New Roman" w:hAnsi="Times New Roman"/>
-          <w:b/>
-          <w:bCs/>
-        </w:rPr>
-        <w:t>Sistema de recordator</w:t>
-      </w:r>
-      <w:r>
-        <w:rPr>
-          <w:rFonts w:ascii="Times New Roman" w:hAnsi="Times New Roman"/>
-          <w:b/>
-          <w:bCs/>
-        </w:rPr>
-        <w:t>ios:</w:t>
-      </w:r>
-      <w:r>
-        <w:rPr>
-          <w:rFonts w:ascii="Times New Roman" w:hAnsi="Times New Roman"/>
-        </w:rPr>
-        <w:t xml:space="preserve"> Generación de notificaciones o alertas automáticas previas a la cita para mitigar el olvido por parte de los clientes.</w:t>
-      </w:r>
-    </w:p>
-    <w:p>
-      <w:pPr>
-        <w:rPr>
-          <w:rFonts w:ascii="Times New Roman" w:hAnsi="Times New Roman"/>
-        </w:rPr>
-      </w:pPr>
-    </w:p>
-    <w:p>
-      <w:pPr>
-        <w:pStyle w:val="Ttulo2"/>
-      </w:pPr>
-      <w:bookmarkStart w:id="12" w:name="_Toc241862483"/>
-      <w:r>
-        <w:t>Exclusiones</w:t>
-      </w:r>
-      <w:bookmarkEnd w:id="12"/>
-    </w:p>
-    <w:p>
-      <w:pPr>
-        <w:spacing w:line="480" w:lineRule="auto"/>
-        <w:ind w:firstLine="720"/>
-        <w:rPr>
-          <w:rFonts w:ascii="Times New Roman" w:hAnsi="Times New Roman"/>
-        </w:rPr>
-      </w:pPr>
-      <w:r>
-        <w:rPr>
-          <w:rFonts w:ascii="Times New Roman" w:hAnsi="Times New Roman"/>
-        </w:rPr>
-        <w:t xml:space="preserve">Para delimitar correctamente el desarrollo, esta versión de la aplicación </w:t>
-      </w:r>
-      <w:r>
-        <w:rPr>
-          <w:rFonts w:ascii="Times New Roman" w:hAnsi="Times New Roman"/>
-          <w:b/>
-          <w:bCs/>
-        </w:rPr>
-        <w:t>no</w:t>
-      </w:r>
-      <w:r>
-        <w:rPr>
-          <w:rFonts w:ascii="Times New Roman" w:hAnsi="Times New Roman"/>
-        </w:rPr>
-        <w:t xml:space="preserve"> contempla integraciones con pasarelas de p</w:t>
-      </w:r>
-      <w:r>
-        <w:rPr>
-          <w:rFonts w:ascii="Times New Roman" w:hAnsi="Times New Roman"/>
-        </w:rPr>
-        <w:t>ago en línea (los cobros se seguirán realizando en el local), no incluye módulos de facturación electrónica contable, y tampoco abarcará la gestión de inventario de productos físicos (como venta de ceras, lociones o cuchillas). El proyecto está enfocado es</w:t>
-      </w:r>
-      <w:r>
-        <w:rPr>
-          <w:rFonts w:ascii="Times New Roman" w:hAnsi="Times New Roman"/>
-        </w:rPr>
-        <w:t>trictamente en la optimización operativa de los servicios y el tiempo.</w:t>
-      </w:r>
     </w:p>
     <w:p>
       <w:pPr>
@@ -2925,7 +2019,7 @@
           <w:szCs w:val="24"/>
         </w:rPr>
       </w:pPr>
-      <w:bookmarkStart w:id="13" w:name="_Toc1041586158"/>
+      <w:bookmarkStart w:id="8" w:name="_Toc1041586158"/>
       <w:r>
         <w:rPr>
           <w:rFonts w:eastAsia="Times New Roman" w:cs="Times New Roman"/>
@@ -2935,7 +2029,7 @@
         <w:lastRenderedPageBreak/>
         <w:t>Reglamento y condiciones legales</w:t>
       </w:r>
-      <w:bookmarkEnd w:id="13"/>
+      <w:bookmarkEnd w:id="8"/>
     </w:p>
     <w:p>
       <w:pPr>
@@ -2964,14 +2058,20 @@
       <w:pPr>
         <w:pStyle w:val="Apa7ma"/>
         <w:rPr>
+          <w:b/>
+          <w:bCs/>
           <w:highlight w:val="black"/>
         </w:rPr>
       </w:pPr>
-      <w:bookmarkStart w:id="14" w:name="_Toc1176526101"/>
-      <w:r>
+      <w:bookmarkStart w:id="9" w:name="_Toc1176526101"/>
+      <w:r>
+        <w:rPr>
+          <w:b/>
+          <w:bCs/>
+        </w:rPr>
         <w:t>1. Normativa y Protección de Datos Personales (Ley 1581 de 2012 - Colombia)</w:t>
       </w:r>
-      <w:bookmarkEnd w:id="14"/>
+      <w:bookmarkEnd w:id="9"/>
     </w:p>
     <w:p>
       <w:pPr>
@@ -3040,14 +2140,20 @@
       <w:pPr>
         <w:pStyle w:val="Apa7ma"/>
         <w:rPr>
+          <w:b/>
+          <w:bCs/>
           <w:highlight w:val="black"/>
         </w:rPr>
       </w:pPr>
-      <w:bookmarkStart w:id="15" w:name="_Toc274514620"/>
-      <w:r>
+      <w:bookmarkStart w:id="10" w:name="_Toc274514620"/>
+      <w:r>
+        <w:rPr>
+          <w:b/>
+          <w:bCs/>
+        </w:rPr>
         <w:t>2. Licenciamiento de Software y Propiedad Intelectual</w:t>
       </w:r>
-      <w:bookmarkEnd w:id="15"/>
+      <w:bookmarkEnd w:id="10"/>
     </w:p>
     <w:p>
       <w:pPr>
@@ -3136,14 +2242,20 @@
       <w:pPr>
         <w:pStyle w:val="Apa7ma"/>
         <w:rPr>
+          <w:b/>
+          <w:bCs/>
           <w:highlight w:val="black"/>
         </w:rPr>
       </w:pPr>
-      <w:bookmarkStart w:id="16" w:name="_Toc437200209"/>
-      <w:r>
+      <w:bookmarkStart w:id="11" w:name="_Toc437200209"/>
+      <w:r>
+        <w:rPr>
+          <w:b/>
+          <w:bCs/>
+        </w:rPr>
         <w:t>3. Restricciones Técnicas, Legales y Comerciales</w:t>
       </w:r>
-      <w:bookmarkEnd w:id="16"/>
+      <w:bookmarkEnd w:id="11"/>
     </w:p>
     <w:p>
       <w:pPr>

</xml_diff>